<commit_message>
update Tests. update library MFRT
</commit_message>
<xml_diff>
--- a/Tests/MFRT.py library/Report.docx
+++ b/Tests/MFRT.py library/Report.docx
@@ -425,46 +425,2972 @@
     </w:p>
     <w:p>
       <w:pPr>
-        <w:rPr>
-          <w:lang w:val="en-US"/>
-        </w:rPr>
-      </w:pPr>
-    </w:p>
-    <w:p>
-      <w:pPr>
         <w:jc w:val="center"/>
         <w:rPr>
-          <w:rFonts w:ascii="Consolas" w:hAnsi="Consolas"/>
-          <w:sz w:val="36"/>
-          <w:szCs w:val="36"/>
+          <w:rFonts w:ascii="Times New Roman" w:hAnsi="Times New Roman" w:cs="Times New Roman"/>
+          <w:sz w:val="28"/>
+          <w:szCs w:val="28"/>
           <w:lang w:val="en-US"/>
         </w:rPr>
       </w:pPr>
       <w:r>
         <w:rPr>
-          <w:rFonts w:ascii="Consolas" w:hAnsi="Consolas"/>
-          <w:sz w:val="36"/>
-          <w:szCs w:val="36"/>
-          <w:lang w:val="en-US"/>
-        </w:rPr>
-        <w:t xml:space="preserve">MOKO </w:t>
+          <w:rFonts w:ascii="Times New Roman" w:hAnsi="Times New Roman" w:cs="Times New Roman"/>
+          <w:sz w:val="28"/>
+          <w:szCs w:val="28"/>
+          <w:lang w:val="en-US"/>
+        </w:rPr>
+        <w:t>MOKO Test MFRT library</w:t>
+      </w:r>
+    </w:p>
+    <w:p>
+      <w:pPr>
+        <w:pStyle w:val="a7"/>
+        <w:numPr>
+          <w:ilvl w:val="0"/>
+          <w:numId w:val="7"/>
+        </w:numPr>
+        <w:jc w:val="both"/>
+        <w:rPr>
+          <w:rFonts w:ascii="Times New Roman" w:hAnsi="Times New Roman" w:cs="Times New Roman"/>
+          <w:lang w:val="en-US"/>
+        </w:rPr>
+      </w:pPr>
+      <w:r>
+        <w:rPr>
+          <w:rFonts w:ascii="Times New Roman" w:hAnsi="Times New Roman" w:cs="Times New Roman"/>
+          <w:sz w:val="28"/>
+          <w:szCs w:val="28"/>
+          <w:lang w:val="en-US"/>
+        </w:rPr>
+        <w:t>Testing function convert string to float:</w:t>
+      </w:r>
+    </w:p>
+    <w:p>
+      <w:pPr>
+        <w:ind w:left="360"/>
+        <w:jc w:val="both"/>
+        <w:rPr>
+          <w:rFonts w:ascii="Times New Roman" w:hAnsi="Times New Roman" w:cs="Times New Roman"/>
+          <w:lang w:val="en-US"/>
+        </w:rPr>
+      </w:pPr>
+    </w:p>
+    <w:p>
+      <w:pPr>
+        <w:pStyle w:val="a7"/>
+        <w:jc w:val="both"/>
+        <w:rPr>
+          <w:rFonts w:ascii="Times New Roman" w:hAnsi="Times New Roman" w:cs="Times New Roman"/>
+          <w:lang w:val="en-US"/>
+        </w:rPr>
+      </w:pPr>
+      <w:r>
+        <w:rPr>
+          <w:rFonts w:ascii="Times New Roman" w:hAnsi="Times New Roman" w:cs="Times New Roman"/>
+          <w:sz w:val="28"/>
+          <w:szCs w:val="28"/>
+          <w:lang w:val="ru-RU"/>
+        </w:rPr>
+        <w:t xml:space="preserve">А) </w:t>
       </w:r>
       <w:r>
         <w:rPr>
-          <w:rFonts w:ascii="Consolas" w:hAnsi="Consolas"/>
-          <w:sz w:val="36"/>
-          <w:szCs w:val="36"/>
-          <w:lang w:val="en-US"/>
-        </w:rPr>
-        <w:t>Testing Messenger</w:t>
+          <w:rFonts w:ascii="Times New Roman" w:hAnsi="Times New Roman" w:cs="Times New Roman"/>
+          <w:sz w:val="28"/>
+          <w:szCs w:val="28"/>
+          <w:lang w:val="en-US"/>
+        </w:rPr>
+        <w:t>Normal value</w:t>
       </w:r>
-    </w:p>
-    <w:p>
-      <w:pPr>
-        <w:rPr>
-          <w:rFonts w:ascii="Consolas" w:hAnsi="Consolas"/>
-          <w:sz w:val="36"/>
-          <w:szCs w:val="36"/>
+      <w:r>
+        <w:rPr>
+          <w:rFonts w:ascii="Times New Roman" w:hAnsi="Times New Roman" w:cs="Times New Roman"/>
+          <w:sz w:val="28"/>
+          <w:szCs w:val="28"/>
+          <w:lang w:val="en-US"/>
+        </w:rPr>
+        <w:tab/>
+      </w:r>
+      <w:r>
+        <w:rPr>
+          <w:rFonts w:ascii="Times New Roman" w:hAnsi="Times New Roman" w:cs="Times New Roman"/>
+          <w:sz w:val="28"/>
+          <w:szCs w:val="28"/>
+          <w:lang w:val="en-US"/>
+        </w:rPr>
+        <w:tab/>
+      </w:r>
+      <w:r>
+        <w:rPr>
+          <w:rFonts w:ascii="Times New Roman" w:hAnsi="Times New Roman" w:cs="Times New Roman"/>
+          <w:lang w:val="en-US"/>
+        </w:rPr>
+        <w:tab/>
+      </w:r>
+      <w:r>
+        <w:rPr>
+          <w:rFonts w:ascii="Times New Roman" w:hAnsi="Times New Roman" w:cs="Times New Roman"/>
+          <w:lang w:val="en-US"/>
+        </w:rPr>
+        <w:tab/>
+      </w:r>
+    </w:p>
+    <w:tbl>
+      <w:tblPr>
+        <w:tblStyle w:val="a8"/>
+        <w:tblW w:w="10201" w:type="dxa"/>
+        <w:tblLook w:val="04A0" w:firstRow="1" w:lastRow="0" w:firstColumn="1" w:lastColumn="0" w:noHBand="0" w:noVBand="1"/>
+      </w:tblPr>
+      <w:tblGrid>
+        <w:gridCol w:w="4390"/>
+        <w:gridCol w:w="5811"/>
+      </w:tblGrid>
+      <w:tr>
+        <w:trPr>
+          <w:trHeight w:val="787"/>
+        </w:trPr>
+        <w:tc>
+          <w:tcPr>
+            <w:tcW w:w="4390" w:type="dxa"/>
+          </w:tcPr>
+          <w:p>
+            <w:pPr>
+              <w:jc w:val="center"/>
+              <w:rPr>
+                <w:rFonts w:ascii="Times New Roman" w:hAnsi="Times New Roman" w:cs="Times New Roman"/>
+                <w:b/>
+                <w:bCs/>
+                <w:sz w:val="24"/>
+                <w:szCs w:val="24"/>
+                <w:lang w:val="en-US"/>
+              </w:rPr>
+            </w:pPr>
+            <w:bookmarkStart w:id="0" w:name="StringToFloat"/>
+            <w:r>
+              <w:rPr>
+                <w:rFonts w:ascii="Times New Roman" w:hAnsi="Times New Roman" w:cs="Times New Roman"/>
+                <w:b/>
+                <w:bCs/>
+                <w:sz w:val="24"/>
+                <w:szCs w:val="24"/>
+                <w:lang w:val="en-US"/>
+              </w:rPr>
+              <w:t>Input value</w:t>
+            </w:r>
+          </w:p>
+        </w:tc>
+        <w:tc>
+          <w:tcPr>
+            <w:tcW w:w="5811" w:type="dxa"/>
+          </w:tcPr>
+          <w:p>
+            <w:pPr>
+              <w:jc w:val="center"/>
+              <w:rPr>
+                <w:rFonts w:ascii="Times New Roman" w:hAnsi="Times New Roman" w:cs="Times New Roman"/>
+                <w:b/>
+                <w:bCs/>
+                <w:sz w:val="24"/>
+                <w:szCs w:val="24"/>
+                <w:lang w:val="en-US"/>
+              </w:rPr>
+            </w:pPr>
+            <w:r>
+              <w:rPr>
+                <w:rFonts w:ascii="Times New Roman" w:hAnsi="Times New Roman" w:cs="Times New Roman"/>
+                <w:b/>
+                <w:bCs/>
+                <w:sz w:val="24"/>
+                <w:szCs w:val="24"/>
+                <w:lang w:val="en-US"/>
+              </w:rPr>
+              <w:t>Output value</w:t>
+            </w:r>
+          </w:p>
+        </w:tc>
+      </w:tr>
+      <w:tr>
+        <w:tc>
+          <w:tcPr>
+            <w:tcW w:w="4390" w:type="dxa"/>
+          </w:tcPr>
+          <w:p>
+            <w:pPr>
+              <w:jc w:val="center"/>
+              <w:rPr>
+                <w:rFonts w:ascii="Times New Roman" w:hAnsi="Times New Roman" w:cs="Times New Roman"/>
+                <w:lang w:val="en-US"/>
+              </w:rPr>
+            </w:pPr>
+          </w:p>
+        </w:tc>
+        <w:tc>
+          <w:tcPr>
+            <w:tcW w:w="5811" w:type="dxa"/>
+          </w:tcPr>
+          <w:p>
+            <w:pPr>
+              <w:jc w:val="center"/>
+              <w:rPr>
+                <w:rFonts w:ascii="Times New Roman" w:hAnsi="Times New Roman" w:cs="Times New Roman"/>
+                <w:lang w:val="en-US"/>
+              </w:rPr>
+            </w:pPr>
+          </w:p>
+        </w:tc>
+      </w:tr>
+      <w:bookmarkEnd w:id="0"/>
+    </w:tbl>
+    <w:p>
+      <w:pPr>
+        <w:ind w:firstLine="426"/>
+        <w:jc w:val="both"/>
+        <w:rPr>
+          <w:lang w:val="en-US"/>
+        </w:rPr>
+      </w:pPr>
+    </w:p>
+    <w:p>
+      <w:pPr>
+        <w:rPr>
+          <w:lang w:val="en-US"/>
+        </w:rPr>
+      </w:pPr>
+      <w:r>
+        <w:rPr>
+          <w:lang w:val="en-US"/>
+        </w:rPr>
+        <w:br w:type="page"/>
+      </w:r>
+    </w:p>
+    <w:p>
+      <w:pPr>
+        <w:pStyle w:val="a7"/>
+        <w:jc w:val="both"/>
+        <w:rPr>
+          <w:rFonts w:ascii="Times New Roman" w:hAnsi="Times New Roman" w:cs="Times New Roman"/>
+          <w:lang w:val="en-US"/>
+        </w:rPr>
+      </w:pPr>
+      <w:r>
+        <w:rPr>
+          <w:rFonts w:ascii="Times New Roman" w:hAnsi="Times New Roman" w:cs="Times New Roman"/>
+          <w:sz w:val="28"/>
+          <w:szCs w:val="28"/>
+          <w:lang w:val="en-US"/>
+        </w:rPr>
+        <w:lastRenderedPageBreak/>
+        <w:t>B</w:t>
+      </w:r>
+      <w:r>
+        <w:rPr>
+          <w:rFonts w:ascii="Times New Roman" w:hAnsi="Times New Roman" w:cs="Times New Roman"/>
+          <w:sz w:val="28"/>
+          <w:szCs w:val="28"/>
+          <w:lang w:val="ru-RU"/>
+        </w:rPr>
+        <w:t xml:space="preserve">) </w:t>
+      </w:r>
+      <w:r>
+        <w:rPr>
+          <w:rFonts w:ascii="Times New Roman" w:hAnsi="Times New Roman" w:cs="Times New Roman"/>
+          <w:sz w:val="28"/>
+          <w:szCs w:val="28"/>
+          <w:lang w:val="en-US"/>
+        </w:rPr>
+        <w:t>Error delimiter</w:t>
+      </w:r>
+      <w:r>
+        <w:rPr>
+          <w:rFonts w:ascii="Times New Roman" w:hAnsi="Times New Roman" w:cs="Times New Roman"/>
+          <w:sz w:val="28"/>
+          <w:szCs w:val="28"/>
+          <w:lang w:val="en-US"/>
+        </w:rPr>
+        <w:tab/>
+      </w:r>
+      <w:r>
+        <w:rPr>
+          <w:rFonts w:ascii="Times New Roman" w:hAnsi="Times New Roman" w:cs="Times New Roman"/>
+          <w:sz w:val="28"/>
+          <w:szCs w:val="28"/>
+          <w:lang w:val="en-US"/>
+        </w:rPr>
+        <w:tab/>
+      </w:r>
+      <w:r>
+        <w:rPr>
+          <w:rFonts w:ascii="Times New Roman" w:hAnsi="Times New Roman" w:cs="Times New Roman"/>
+          <w:lang w:val="en-US"/>
+        </w:rPr>
+        <w:tab/>
+      </w:r>
+      <w:r>
+        <w:rPr>
+          <w:rFonts w:ascii="Times New Roman" w:hAnsi="Times New Roman" w:cs="Times New Roman"/>
+          <w:lang w:val="en-US"/>
+        </w:rPr>
+        <w:tab/>
+      </w:r>
+    </w:p>
+    <w:tbl>
+      <w:tblPr>
+        <w:tblStyle w:val="a8"/>
+        <w:tblW w:w="10201" w:type="dxa"/>
+        <w:tblLook w:val="04A0" w:firstRow="1" w:lastRow="0" w:firstColumn="1" w:lastColumn="0" w:noHBand="0" w:noVBand="1"/>
+      </w:tblPr>
+      <w:tblGrid>
+        <w:gridCol w:w="4390"/>
+        <w:gridCol w:w="5811"/>
+      </w:tblGrid>
+      <w:tr>
+        <w:trPr>
+          <w:trHeight w:val="787"/>
+        </w:trPr>
+        <w:tc>
+          <w:tcPr>
+            <w:tcW w:w="4390" w:type="dxa"/>
+          </w:tcPr>
+          <w:p>
+            <w:pPr>
+              <w:jc w:val="center"/>
+              <w:rPr>
+                <w:rFonts w:ascii="Times New Roman" w:hAnsi="Times New Roman" w:cs="Times New Roman"/>
+                <w:b/>
+                <w:bCs/>
+                <w:sz w:val="24"/>
+                <w:szCs w:val="24"/>
+                <w:lang w:val="en-US"/>
+              </w:rPr>
+            </w:pPr>
+            <w:bookmarkStart w:id="1" w:name="StringToFloatFailedDelimiter"/>
+            <w:r>
+              <w:rPr>
+                <w:rFonts w:ascii="Times New Roman" w:hAnsi="Times New Roman" w:cs="Times New Roman"/>
+                <w:b/>
+                <w:bCs/>
+                <w:sz w:val="24"/>
+                <w:szCs w:val="24"/>
+                <w:lang w:val="en-US"/>
+              </w:rPr>
+              <w:t>Input value</w:t>
+            </w:r>
+          </w:p>
+        </w:tc>
+        <w:tc>
+          <w:tcPr>
+            <w:tcW w:w="5811" w:type="dxa"/>
+          </w:tcPr>
+          <w:p>
+            <w:pPr>
+              <w:jc w:val="center"/>
+              <w:rPr>
+                <w:rFonts w:ascii="Times New Roman" w:hAnsi="Times New Roman" w:cs="Times New Roman"/>
+                <w:b/>
+                <w:bCs/>
+                <w:sz w:val="24"/>
+                <w:szCs w:val="24"/>
+                <w:lang w:val="en-US"/>
+              </w:rPr>
+            </w:pPr>
+            <w:r>
+              <w:rPr>
+                <w:rFonts w:ascii="Times New Roman" w:hAnsi="Times New Roman" w:cs="Times New Roman"/>
+                <w:b/>
+                <w:bCs/>
+                <w:sz w:val="24"/>
+                <w:szCs w:val="24"/>
+                <w:lang w:val="en-US"/>
+              </w:rPr>
+              <w:t>Output value</w:t>
+            </w:r>
+          </w:p>
+        </w:tc>
+      </w:tr>
+      <w:tr>
+        <w:tc>
+          <w:tcPr>
+            <w:tcW w:w="4390" w:type="dxa"/>
+          </w:tcPr>
+          <w:p>
+            <w:pPr>
+              <w:jc w:val="center"/>
+              <w:rPr>
+                <w:rFonts w:ascii="Times New Roman" w:hAnsi="Times New Roman" w:cs="Times New Roman"/>
+                <w:lang w:val="en-US"/>
+              </w:rPr>
+            </w:pPr>
+          </w:p>
+        </w:tc>
+        <w:tc>
+          <w:tcPr>
+            <w:tcW w:w="5811" w:type="dxa"/>
+          </w:tcPr>
+          <w:p>
+            <w:pPr>
+              <w:jc w:val="center"/>
+              <w:rPr>
+                <w:rFonts w:ascii="Times New Roman" w:hAnsi="Times New Roman" w:cs="Times New Roman"/>
+                <w:lang w:val="en-US"/>
+              </w:rPr>
+            </w:pPr>
+          </w:p>
+        </w:tc>
+      </w:tr>
+      <w:bookmarkEnd w:id="1"/>
+    </w:tbl>
+    <w:p>
+      <w:pPr>
+        <w:ind w:firstLine="426"/>
+        <w:jc w:val="both"/>
+        <w:rPr>
+          <w:lang w:val="en-US"/>
+        </w:rPr>
+      </w:pPr>
+    </w:p>
+    <w:p>
+      <w:pPr>
+        <w:pStyle w:val="a7"/>
+        <w:jc w:val="both"/>
+        <w:rPr>
+          <w:rFonts w:ascii="Times New Roman" w:hAnsi="Times New Roman" w:cs="Times New Roman"/>
+          <w:lang w:val="en-US"/>
+        </w:rPr>
+      </w:pPr>
+      <w:r>
+        <w:rPr>
+          <w:rFonts w:ascii="Times New Roman" w:hAnsi="Times New Roman" w:cs="Times New Roman"/>
+          <w:sz w:val="28"/>
+          <w:szCs w:val="28"/>
+          <w:lang w:val="en-US"/>
+        </w:rPr>
+        <w:t>C</w:t>
+      </w:r>
+      <w:r>
+        <w:rPr>
+          <w:rFonts w:ascii="Times New Roman" w:hAnsi="Times New Roman" w:cs="Times New Roman"/>
+          <w:sz w:val="28"/>
+          <w:szCs w:val="28"/>
+          <w:lang w:val="ru-RU"/>
+        </w:rPr>
+        <w:t xml:space="preserve">) </w:t>
+      </w:r>
+      <w:r>
+        <w:rPr>
+          <w:rFonts w:ascii="Times New Roman" w:hAnsi="Times New Roman" w:cs="Times New Roman"/>
+          <w:sz w:val="28"/>
+          <w:szCs w:val="28"/>
+          <w:lang w:val="en-US"/>
+        </w:rPr>
+        <w:t>Error input value</w:t>
+      </w:r>
+      <w:r>
+        <w:rPr>
+          <w:rFonts w:ascii="Times New Roman" w:hAnsi="Times New Roman" w:cs="Times New Roman"/>
+          <w:sz w:val="28"/>
+          <w:szCs w:val="28"/>
+          <w:lang w:val="en-US"/>
+        </w:rPr>
+        <w:tab/>
+      </w:r>
+      <w:r>
+        <w:rPr>
+          <w:rFonts w:ascii="Times New Roman" w:hAnsi="Times New Roman" w:cs="Times New Roman"/>
+          <w:sz w:val="28"/>
+          <w:szCs w:val="28"/>
+          <w:lang w:val="en-US"/>
+        </w:rPr>
+        <w:tab/>
+      </w:r>
+      <w:r>
+        <w:rPr>
+          <w:rFonts w:ascii="Times New Roman" w:hAnsi="Times New Roman" w:cs="Times New Roman"/>
+          <w:lang w:val="en-US"/>
+        </w:rPr>
+        <w:tab/>
+      </w:r>
+      <w:r>
+        <w:rPr>
+          <w:rFonts w:ascii="Times New Roman" w:hAnsi="Times New Roman" w:cs="Times New Roman"/>
+          <w:lang w:val="en-US"/>
+        </w:rPr>
+        <w:tab/>
+      </w:r>
+    </w:p>
+    <w:tbl>
+      <w:tblPr>
+        <w:tblStyle w:val="a8"/>
+        <w:tblW w:w="10201" w:type="dxa"/>
+        <w:tblLook w:val="04A0" w:firstRow="1" w:lastRow="0" w:firstColumn="1" w:lastColumn="0" w:noHBand="0" w:noVBand="1"/>
+      </w:tblPr>
+      <w:tblGrid>
+        <w:gridCol w:w="4390"/>
+        <w:gridCol w:w="5811"/>
+      </w:tblGrid>
+      <w:tr>
+        <w:trPr>
+          <w:trHeight w:val="787"/>
+        </w:trPr>
+        <w:tc>
+          <w:tcPr>
+            <w:tcW w:w="4390" w:type="dxa"/>
+          </w:tcPr>
+          <w:p>
+            <w:pPr>
+              <w:jc w:val="center"/>
+              <w:rPr>
+                <w:rFonts w:ascii="Times New Roman" w:hAnsi="Times New Roman" w:cs="Times New Roman"/>
+                <w:b/>
+                <w:bCs/>
+                <w:sz w:val="24"/>
+                <w:szCs w:val="24"/>
+                <w:lang w:val="en-US"/>
+              </w:rPr>
+            </w:pPr>
+            <w:bookmarkStart w:id="2" w:name="StringToFloatFailedPrefixOrValue"/>
+            <w:r>
+              <w:rPr>
+                <w:rFonts w:ascii="Times New Roman" w:hAnsi="Times New Roman" w:cs="Times New Roman"/>
+                <w:b/>
+                <w:bCs/>
+                <w:sz w:val="24"/>
+                <w:szCs w:val="24"/>
+                <w:lang w:val="en-US"/>
+              </w:rPr>
+              <w:t>Input value</w:t>
+            </w:r>
+          </w:p>
+        </w:tc>
+        <w:tc>
+          <w:tcPr>
+            <w:tcW w:w="5811" w:type="dxa"/>
+          </w:tcPr>
+          <w:p>
+            <w:pPr>
+              <w:jc w:val="center"/>
+              <w:rPr>
+                <w:rFonts w:ascii="Times New Roman" w:hAnsi="Times New Roman" w:cs="Times New Roman"/>
+                <w:b/>
+                <w:bCs/>
+                <w:sz w:val="24"/>
+                <w:szCs w:val="24"/>
+                <w:lang w:val="en-US"/>
+              </w:rPr>
+            </w:pPr>
+            <w:r>
+              <w:rPr>
+                <w:rFonts w:ascii="Times New Roman" w:hAnsi="Times New Roman" w:cs="Times New Roman"/>
+                <w:b/>
+                <w:bCs/>
+                <w:sz w:val="24"/>
+                <w:szCs w:val="24"/>
+                <w:lang w:val="en-US"/>
+              </w:rPr>
+              <w:t>Output value</w:t>
+            </w:r>
+          </w:p>
+        </w:tc>
+      </w:tr>
+      <w:tr>
+        <w:tc>
+          <w:tcPr>
+            <w:tcW w:w="4390" w:type="dxa"/>
+          </w:tcPr>
+          <w:p>
+            <w:pPr>
+              <w:jc w:val="center"/>
+              <w:rPr>
+                <w:rFonts w:ascii="Times New Roman" w:hAnsi="Times New Roman" w:cs="Times New Roman"/>
+                <w:lang w:val="en-US"/>
+              </w:rPr>
+            </w:pPr>
+          </w:p>
+        </w:tc>
+        <w:tc>
+          <w:tcPr>
+            <w:tcW w:w="5811" w:type="dxa"/>
+          </w:tcPr>
+          <w:p>
+            <w:pPr>
+              <w:jc w:val="center"/>
+              <w:rPr>
+                <w:rFonts w:ascii="Times New Roman" w:hAnsi="Times New Roman" w:cs="Times New Roman"/>
+                <w:lang w:val="en-US"/>
+              </w:rPr>
+            </w:pPr>
+          </w:p>
+        </w:tc>
+      </w:tr>
+      <w:bookmarkEnd w:id="2"/>
+    </w:tbl>
+    <w:p>
+      <w:pPr>
+        <w:jc w:val="both"/>
+        <w:rPr>
+          <w:rFonts w:ascii="Times New Roman" w:hAnsi="Times New Roman" w:cs="Times New Roman"/>
+          <w:sz w:val="28"/>
+          <w:szCs w:val="28"/>
+          <w:lang w:val="en-US"/>
+        </w:rPr>
+      </w:pPr>
+    </w:p>
+    <w:p>
+      <w:pPr>
+        <w:pStyle w:val="a7"/>
+        <w:numPr>
+          <w:ilvl w:val="0"/>
+          <w:numId w:val="7"/>
+        </w:numPr>
+        <w:ind w:left="567"/>
+        <w:jc w:val="both"/>
+        <w:rPr>
+          <w:rFonts w:ascii="Times New Roman" w:hAnsi="Times New Roman" w:cs="Times New Roman"/>
+          <w:sz w:val="28"/>
+          <w:szCs w:val="28"/>
+          <w:lang w:val="en-US"/>
+        </w:rPr>
+      </w:pPr>
+      <w:r>
+        <w:rPr>
+          <w:rFonts w:ascii="Times New Roman" w:hAnsi="Times New Roman" w:cs="Times New Roman"/>
+          <w:sz w:val="28"/>
+          <w:szCs w:val="28"/>
+          <w:lang w:val="en-US"/>
+        </w:rPr>
+        <w:t>Testing function convert float to string</w:t>
+      </w:r>
+    </w:p>
+    <w:p>
+      <w:pPr>
+        <w:jc w:val="both"/>
+        <w:rPr>
+          <w:rFonts w:ascii="Times New Roman" w:hAnsi="Times New Roman" w:cs="Times New Roman"/>
+          <w:lang w:val="en-US"/>
+        </w:rPr>
+      </w:pPr>
+    </w:p>
+    <w:p>
+      <w:pPr>
+        <w:pStyle w:val="a7"/>
+        <w:numPr>
+          <w:ilvl w:val="0"/>
+          <w:numId w:val="8"/>
+        </w:numPr>
+        <w:jc w:val="both"/>
+        <w:rPr>
+          <w:rFonts w:ascii="Times New Roman" w:hAnsi="Times New Roman" w:cs="Times New Roman"/>
+          <w:sz w:val="28"/>
+          <w:szCs w:val="28"/>
+          <w:lang w:val="en-US"/>
+        </w:rPr>
+      </w:pPr>
+      <w:r>
+        <w:rPr>
+          <w:rFonts w:ascii="Times New Roman" w:hAnsi="Times New Roman" w:cs="Times New Roman"/>
+          <w:sz w:val="28"/>
+          <w:szCs w:val="28"/>
+          <w:lang w:val="en-US"/>
+        </w:rPr>
+        <w:t>Converting string from reference number</w:t>
+      </w:r>
+    </w:p>
+    <w:tbl>
+      <w:tblPr>
+        <w:tblStyle w:val="a8"/>
+        <w:tblW w:w="0" w:type="auto"/>
+        <w:tblLook w:val="04A0" w:firstRow="1" w:lastRow="0" w:firstColumn="1" w:lastColumn="0" w:noHBand="0" w:noVBand="1"/>
+      </w:tblPr>
+      <w:tblGrid>
+        <w:gridCol w:w="1834"/>
+        <w:gridCol w:w="1841"/>
+        <w:gridCol w:w="1416"/>
+        <w:gridCol w:w="1696"/>
+        <w:gridCol w:w="1189"/>
+        <w:gridCol w:w="2219"/>
+      </w:tblGrid>
+      <w:tr>
+        <w:trPr>
+          <w:trHeight w:val="787"/>
+        </w:trPr>
+        <w:tc>
+          <w:tcPr>
+            <w:tcW w:w="1838" w:type="dxa"/>
+          </w:tcPr>
+          <w:p>
+            <w:pPr>
+              <w:jc w:val="center"/>
+              <w:rPr>
+                <w:rFonts w:ascii="Times New Roman" w:hAnsi="Times New Roman" w:cs="Times New Roman"/>
+                <w:b/>
+                <w:bCs/>
+                <w:sz w:val="24"/>
+                <w:szCs w:val="24"/>
+                <w:lang w:val="en-US"/>
+              </w:rPr>
+            </w:pPr>
+            <w:bookmarkStart w:id="3" w:name="StringConvertingRefNumber"/>
+            <w:r>
+              <w:rPr>
+                <w:rFonts w:ascii="Times New Roman" w:hAnsi="Times New Roman" w:cs="Times New Roman"/>
+                <w:b/>
+                <w:bCs/>
+                <w:sz w:val="24"/>
+                <w:szCs w:val="24"/>
+                <w:lang w:val="en-US"/>
+              </w:rPr>
+              <w:t>Input value</w:t>
+            </w:r>
+          </w:p>
+        </w:tc>
+        <w:tc>
+          <w:tcPr>
+            <w:tcW w:w="1843" w:type="dxa"/>
+          </w:tcPr>
+          <w:p>
+            <w:pPr>
+              <w:jc w:val="center"/>
+              <w:rPr>
+                <w:rFonts w:ascii="Times New Roman" w:hAnsi="Times New Roman" w:cs="Times New Roman"/>
+                <w:b/>
+                <w:bCs/>
+                <w:sz w:val="24"/>
+                <w:szCs w:val="24"/>
+                <w:lang w:val="en-US"/>
+              </w:rPr>
+            </w:pPr>
+            <w:r>
+              <w:rPr>
+                <w:rFonts w:ascii="Times New Roman" w:hAnsi="Times New Roman" w:cs="Times New Roman"/>
+                <w:b/>
+                <w:bCs/>
+                <w:sz w:val="24"/>
+                <w:szCs w:val="24"/>
+                <w:lang w:val="en-US"/>
+              </w:rPr>
+              <w:t>Reference number</w:t>
+            </w:r>
+          </w:p>
+        </w:tc>
+        <w:tc>
+          <w:tcPr>
+            <w:tcW w:w="1416" w:type="dxa"/>
+          </w:tcPr>
+          <w:p>
+            <w:pPr>
+              <w:jc w:val="center"/>
+              <w:rPr>
+                <w:rFonts w:ascii="Times New Roman" w:hAnsi="Times New Roman" w:cs="Times New Roman"/>
+                <w:b/>
+                <w:bCs/>
+                <w:sz w:val="24"/>
+                <w:szCs w:val="24"/>
+                <w:lang w:val="en-US"/>
+              </w:rPr>
+            </w:pPr>
+            <w:r>
+              <w:rPr>
+                <w:rFonts w:ascii="Times New Roman" w:hAnsi="Times New Roman" w:cs="Times New Roman"/>
+                <w:b/>
+                <w:bCs/>
+                <w:sz w:val="24"/>
+                <w:szCs w:val="24"/>
+                <w:lang w:val="en-US"/>
+              </w:rPr>
+              <w:t>Resolution</w:t>
+            </w:r>
+          </w:p>
+        </w:tc>
+        <w:tc>
+          <w:tcPr>
+            <w:tcW w:w="1699" w:type="dxa"/>
+          </w:tcPr>
+          <w:p>
+            <w:pPr>
+              <w:jc w:val="center"/>
+              <w:rPr>
+                <w:rFonts w:ascii="Times New Roman" w:hAnsi="Times New Roman" w:cs="Times New Roman"/>
+                <w:b/>
+                <w:bCs/>
+                <w:sz w:val="24"/>
+                <w:szCs w:val="24"/>
+                <w:lang w:val="en-US"/>
+              </w:rPr>
+            </w:pPr>
+            <w:r>
+              <w:rPr>
+                <w:rFonts w:ascii="Times New Roman" w:hAnsi="Times New Roman" w:cs="Times New Roman"/>
+                <w:b/>
+                <w:bCs/>
+                <w:sz w:val="24"/>
+                <w:szCs w:val="24"/>
+                <w:lang w:val="en-US"/>
+              </w:rPr>
+              <w:t>Prefix</w:t>
+            </w:r>
+          </w:p>
+        </w:tc>
+        <w:tc>
+          <w:tcPr>
+            <w:tcW w:w="1175" w:type="dxa"/>
+          </w:tcPr>
+          <w:p>
+            <w:pPr>
+              <w:jc w:val="center"/>
+              <w:rPr>
+                <w:rFonts w:ascii="Times New Roman" w:hAnsi="Times New Roman" w:cs="Times New Roman"/>
+                <w:b/>
+                <w:bCs/>
+                <w:sz w:val="24"/>
+                <w:szCs w:val="24"/>
+                <w:lang w:val="en-US"/>
+              </w:rPr>
+            </w:pPr>
+            <w:r>
+              <w:rPr>
+                <w:rFonts w:ascii="Times New Roman" w:hAnsi="Times New Roman" w:cs="Times New Roman"/>
+                <w:b/>
+                <w:bCs/>
+                <w:sz w:val="24"/>
+                <w:szCs w:val="24"/>
+                <w:lang w:val="en-US"/>
+              </w:rPr>
+              <w:t>Delimiter</w:t>
+            </w:r>
+          </w:p>
+        </w:tc>
+        <w:tc>
+          <w:tcPr>
+            <w:tcW w:w="2224" w:type="dxa"/>
+          </w:tcPr>
+          <w:p>
+            <w:pPr>
+              <w:jc w:val="center"/>
+              <w:rPr>
+                <w:rFonts w:ascii="Times New Roman" w:hAnsi="Times New Roman" w:cs="Times New Roman"/>
+                <w:b/>
+                <w:bCs/>
+                <w:sz w:val="24"/>
+                <w:szCs w:val="24"/>
+                <w:lang w:val="en-US"/>
+              </w:rPr>
+            </w:pPr>
+            <w:r>
+              <w:rPr>
+                <w:rFonts w:ascii="Times New Roman" w:hAnsi="Times New Roman" w:cs="Times New Roman"/>
+                <w:b/>
+                <w:bCs/>
+                <w:sz w:val="24"/>
+                <w:szCs w:val="24"/>
+                <w:lang w:val="en-US"/>
+              </w:rPr>
+              <w:t>Output value</w:t>
+            </w:r>
+          </w:p>
+        </w:tc>
+      </w:tr>
+      <w:tr>
+        <w:tc>
+          <w:tcPr>
+            <w:tcW w:w="1838" w:type="dxa"/>
+          </w:tcPr>
+          <w:p>
+            <w:pPr>
+              <w:jc w:val="center"/>
+              <w:rPr>
+                <w:rFonts w:ascii="Times New Roman" w:hAnsi="Times New Roman" w:cs="Times New Roman"/>
+                <w:lang w:val="en-US"/>
+              </w:rPr>
+            </w:pPr>
+          </w:p>
+        </w:tc>
+        <w:tc>
+          <w:tcPr>
+            <w:tcW w:w="1843" w:type="dxa"/>
+          </w:tcPr>
+          <w:p>
+            <w:pPr>
+              <w:jc w:val="center"/>
+              <w:rPr>
+                <w:rFonts w:ascii="Times New Roman" w:hAnsi="Times New Roman" w:cs="Times New Roman"/>
+                <w:lang w:val="en-US"/>
+              </w:rPr>
+            </w:pPr>
+          </w:p>
+        </w:tc>
+        <w:tc>
+          <w:tcPr>
+            <w:tcW w:w="1416" w:type="dxa"/>
+          </w:tcPr>
+          <w:p>
+            <w:pPr>
+              <w:jc w:val="center"/>
+              <w:rPr>
+                <w:rFonts w:ascii="Times New Roman" w:hAnsi="Times New Roman" w:cs="Times New Roman"/>
+                <w:lang w:val="en-US"/>
+              </w:rPr>
+            </w:pPr>
+          </w:p>
+        </w:tc>
+        <w:tc>
+          <w:tcPr>
+            <w:tcW w:w="1699" w:type="dxa"/>
+          </w:tcPr>
+          <w:p>
+            <w:pPr>
+              <w:jc w:val="center"/>
+              <w:rPr>
+                <w:rFonts w:ascii="Times New Roman" w:hAnsi="Times New Roman" w:cs="Times New Roman"/>
+                <w:lang w:val="en-US"/>
+              </w:rPr>
+            </w:pPr>
+          </w:p>
+        </w:tc>
+        <w:tc>
+          <w:tcPr>
+            <w:tcW w:w="1175" w:type="dxa"/>
+          </w:tcPr>
+          <w:p>
+            <w:pPr>
+              <w:jc w:val="center"/>
+              <w:rPr>
+                <w:rFonts w:ascii="Times New Roman" w:hAnsi="Times New Roman" w:cs="Times New Roman"/>
+                <w:lang w:val="en-US"/>
+              </w:rPr>
+            </w:pPr>
+          </w:p>
+        </w:tc>
+        <w:tc>
+          <w:tcPr>
+            <w:tcW w:w="2224" w:type="dxa"/>
+          </w:tcPr>
+          <w:p>
+            <w:pPr>
+              <w:jc w:val="center"/>
+              <w:rPr>
+                <w:rFonts w:ascii="Times New Roman" w:hAnsi="Times New Roman" w:cs="Times New Roman"/>
+                <w:lang w:val="en-US"/>
+              </w:rPr>
+            </w:pPr>
+          </w:p>
+        </w:tc>
+      </w:tr>
+      <w:bookmarkEnd w:id="3"/>
+    </w:tbl>
+    <w:p>
+      <w:pPr>
+        <w:jc w:val="both"/>
+        <w:rPr>
+          <w:rFonts w:ascii="Times New Roman" w:hAnsi="Times New Roman" w:cs="Times New Roman"/>
+          <w:sz w:val="28"/>
+          <w:szCs w:val="28"/>
+          <w:lang w:val="en-US"/>
+        </w:rPr>
+      </w:pPr>
+    </w:p>
+    <w:p>
+      <w:pPr>
+        <w:pStyle w:val="a7"/>
+        <w:numPr>
+          <w:ilvl w:val="0"/>
+          <w:numId w:val="8"/>
+        </w:numPr>
+        <w:jc w:val="both"/>
+        <w:rPr>
+          <w:rFonts w:ascii="Times New Roman" w:hAnsi="Times New Roman" w:cs="Times New Roman"/>
+          <w:sz w:val="28"/>
+          <w:szCs w:val="28"/>
+          <w:lang w:val="en-US"/>
+        </w:rPr>
+      </w:pPr>
+      <w:r>
+        <w:rPr>
+          <w:rFonts w:ascii="Times New Roman" w:hAnsi="Times New Roman" w:cs="Times New Roman"/>
+          <w:sz w:val="28"/>
+          <w:szCs w:val="28"/>
+          <w:lang w:val="en-US"/>
+        </w:rPr>
+        <w:t xml:space="preserve">Converting </w:t>
+      </w:r>
+      <w:r>
+        <w:rPr>
+          <w:rFonts w:ascii="Times New Roman" w:hAnsi="Times New Roman" w:cs="Times New Roman"/>
+          <w:sz w:val="28"/>
+          <w:szCs w:val="28"/>
+          <w:lang w:val="en-US"/>
+        </w:rPr>
+        <w:t>float</w:t>
+      </w:r>
+      <w:r>
+        <w:rPr>
+          <w:rFonts w:ascii="Times New Roman" w:hAnsi="Times New Roman" w:cs="Times New Roman"/>
+          <w:sz w:val="28"/>
+          <w:szCs w:val="28"/>
+          <w:lang w:val="en-US"/>
+        </w:rPr>
+        <w:t xml:space="preserve"> from reference number</w:t>
+      </w:r>
+    </w:p>
+    <w:tbl>
+      <w:tblPr>
+        <w:tblStyle w:val="a8"/>
+        <w:tblW w:w="0" w:type="auto"/>
+        <w:tblLook w:val="04A0" w:firstRow="1" w:lastRow="0" w:firstColumn="1" w:lastColumn="0" w:noHBand="0" w:noVBand="1"/>
+      </w:tblPr>
+      <w:tblGrid>
+        <w:gridCol w:w="1834"/>
+        <w:gridCol w:w="1841"/>
+        <w:gridCol w:w="1416"/>
+        <w:gridCol w:w="1696"/>
+        <w:gridCol w:w="1189"/>
+        <w:gridCol w:w="2219"/>
+      </w:tblGrid>
+      <w:tr>
+        <w:trPr>
+          <w:trHeight w:val="787"/>
+        </w:trPr>
+        <w:tc>
+          <w:tcPr>
+            <w:tcW w:w="1838" w:type="dxa"/>
+          </w:tcPr>
+          <w:p>
+            <w:pPr>
+              <w:jc w:val="center"/>
+              <w:rPr>
+                <w:rFonts w:ascii="Times New Roman" w:hAnsi="Times New Roman" w:cs="Times New Roman"/>
+                <w:b/>
+                <w:bCs/>
+                <w:sz w:val="24"/>
+                <w:szCs w:val="24"/>
+                <w:lang w:val="en-US"/>
+              </w:rPr>
+            </w:pPr>
+            <w:bookmarkStart w:id="4" w:name="FloatConvertingRefNumber"/>
+            <w:r>
+              <w:rPr>
+                <w:rFonts w:ascii="Times New Roman" w:hAnsi="Times New Roman" w:cs="Times New Roman"/>
+                <w:b/>
+                <w:bCs/>
+                <w:sz w:val="24"/>
+                <w:szCs w:val="24"/>
+                <w:lang w:val="en-US"/>
+              </w:rPr>
+              <w:t>Input value</w:t>
+            </w:r>
+          </w:p>
+        </w:tc>
+        <w:tc>
+          <w:tcPr>
+            <w:tcW w:w="1843" w:type="dxa"/>
+          </w:tcPr>
+          <w:p>
+            <w:pPr>
+              <w:jc w:val="center"/>
+              <w:rPr>
+                <w:rFonts w:ascii="Times New Roman" w:hAnsi="Times New Roman" w:cs="Times New Roman"/>
+                <w:b/>
+                <w:bCs/>
+                <w:sz w:val="24"/>
+                <w:szCs w:val="24"/>
+                <w:lang w:val="en-US"/>
+              </w:rPr>
+            </w:pPr>
+            <w:r>
+              <w:rPr>
+                <w:rFonts w:ascii="Times New Roman" w:hAnsi="Times New Roman" w:cs="Times New Roman"/>
+                <w:b/>
+                <w:bCs/>
+                <w:sz w:val="24"/>
+                <w:szCs w:val="24"/>
+                <w:lang w:val="en-US"/>
+              </w:rPr>
+              <w:t>Reference number</w:t>
+            </w:r>
+          </w:p>
+        </w:tc>
+        <w:tc>
+          <w:tcPr>
+            <w:tcW w:w="1416" w:type="dxa"/>
+          </w:tcPr>
+          <w:p>
+            <w:pPr>
+              <w:jc w:val="center"/>
+              <w:rPr>
+                <w:rFonts w:ascii="Times New Roman" w:hAnsi="Times New Roman" w:cs="Times New Roman"/>
+                <w:b/>
+                <w:bCs/>
+                <w:sz w:val="24"/>
+                <w:szCs w:val="24"/>
+                <w:lang w:val="en-US"/>
+              </w:rPr>
+            </w:pPr>
+            <w:r>
+              <w:rPr>
+                <w:rFonts w:ascii="Times New Roman" w:hAnsi="Times New Roman" w:cs="Times New Roman"/>
+                <w:b/>
+                <w:bCs/>
+                <w:sz w:val="24"/>
+                <w:szCs w:val="24"/>
+                <w:lang w:val="en-US"/>
+              </w:rPr>
+              <w:t>Resolution</w:t>
+            </w:r>
+          </w:p>
+        </w:tc>
+        <w:tc>
+          <w:tcPr>
+            <w:tcW w:w="1699" w:type="dxa"/>
+          </w:tcPr>
+          <w:p>
+            <w:pPr>
+              <w:jc w:val="center"/>
+              <w:rPr>
+                <w:rFonts w:ascii="Times New Roman" w:hAnsi="Times New Roman" w:cs="Times New Roman"/>
+                <w:b/>
+                <w:bCs/>
+                <w:sz w:val="24"/>
+                <w:szCs w:val="24"/>
+                <w:lang w:val="en-US"/>
+              </w:rPr>
+            </w:pPr>
+            <w:r>
+              <w:rPr>
+                <w:rFonts w:ascii="Times New Roman" w:hAnsi="Times New Roman" w:cs="Times New Roman"/>
+                <w:b/>
+                <w:bCs/>
+                <w:sz w:val="24"/>
+                <w:szCs w:val="24"/>
+                <w:lang w:val="en-US"/>
+              </w:rPr>
+              <w:t>Prefix</w:t>
+            </w:r>
+          </w:p>
+        </w:tc>
+        <w:tc>
+          <w:tcPr>
+            <w:tcW w:w="1175" w:type="dxa"/>
+          </w:tcPr>
+          <w:p>
+            <w:pPr>
+              <w:jc w:val="center"/>
+              <w:rPr>
+                <w:rFonts w:ascii="Times New Roman" w:hAnsi="Times New Roman" w:cs="Times New Roman"/>
+                <w:b/>
+                <w:bCs/>
+                <w:sz w:val="24"/>
+                <w:szCs w:val="24"/>
+                <w:lang w:val="en-US"/>
+              </w:rPr>
+            </w:pPr>
+            <w:r>
+              <w:rPr>
+                <w:rFonts w:ascii="Times New Roman" w:hAnsi="Times New Roman" w:cs="Times New Roman"/>
+                <w:b/>
+                <w:bCs/>
+                <w:sz w:val="24"/>
+                <w:szCs w:val="24"/>
+                <w:lang w:val="en-US"/>
+              </w:rPr>
+              <w:t>Delimiter</w:t>
+            </w:r>
+          </w:p>
+        </w:tc>
+        <w:tc>
+          <w:tcPr>
+            <w:tcW w:w="2224" w:type="dxa"/>
+          </w:tcPr>
+          <w:p>
+            <w:pPr>
+              <w:jc w:val="center"/>
+              <w:rPr>
+                <w:rFonts w:ascii="Times New Roman" w:hAnsi="Times New Roman" w:cs="Times New Roman"/>
+                <w:b/>
+                <w:bCs/>
+                <w:sz w:val="24"/>
+                <w:szCs w:val="24"/>
+                <w:lang w:val="en-US"/>
+              </w:rPr>
+            </w:pPr>
+            <w:r>
+              <w:rPr>
+                <w:rFonts w:ascii="Times New Roman" w:hAnsi="Times New Roman" w:cs="Times New Roman"/>
+                <w:b/>
+                <w:bCs/>
+                <w:sz w:val="24"/>
+                <w:szCs w:val="24"/>
+                <w:lang w:val="en-US"/>
+              </w:rPr>
+              <w:t>Output value</w:t>
+            </w:r>
+          </w:p>
+        </w:tc>
+      </w:tr>
+      <w:tr>
+        <w:tc>
+          <w:tcPr>
+            <w:tcW w:w="1838" w:type="dxa"/>
+          </w:tcPr>
+          <w:p>
+            <w:pPr>
+              <w:jc w:val="center"/>
+              <w:rPr>
+                <w:rFonts w:ascii="Times New Roman" w:hAnsi="Times New Roman" w:cs="Times New Roman"/>
+                <w:lang w:val="en-US"/>
+              </w:rPr>
+            </w:pPr>
+          </w:p>
+        </w:tc>
+        <w:tc>
+          <w:tcPr>
+            <w:tcW w:w="1843" w:type="dxa"/>
+          </w:tcPr>
+          <w:p>
+            <w:pPr>
+              <w:jc w:val="center"/>
+              <w:rPr>
+                <w:rFonts w:ascii="Times New Roman" w:hAnsi="Times New Roman" w:cs="Times New Roman"/>
+                <w:lang w:val="en-US"/>
+              </w:rPr>
+            </w:pPr>
+          </w:p>
+        </w:tc>
+        <w:tc>
+          <w:tcPr>
+            <w:tcW w:w="1416" w:type="dxa"/>
+          </w:tcPr>
+          <w:p>
+            <w:pPr>
+              <w:jc w:val="center"/>
+              <w:rPr>
+                <w:rFonts w:ascii="Times New Roman" w:hAnsi="Times New Roman" w:cs="Times New Roman"/>
+                <w:lang w:val="en-US"/>
+              </w:rPr>
+            </w:pPr>
+          </w:p>
+        </w:tc>
+        <w:tc>
+          <w:tcPr>
+            <w:tcW w:w="1699" w:type="dxa"/>
+          </w:tcPr>
+          <w:p>
+            <w:pPr>
+              <w:jc w:val="center"/>
+              <w:rPr>
+                <w:rFonts w:ascii="Times New Roman" w:hAnsi="Times New Roman" w:cs="Times New Roman"/>
+                <w:lang w:val="en-US"/>
+              </w:rPr>
+            </w:pPr>
+          </w:p>
+        </w:tc>
+        <w:tc>
+          <w:tcPr>
+            <w:tcW w:w="1175" w:type="dxa"/>
+          </w:tcPr>
+          <w:p>
+            <w:pPr>
+              <w:jc w:val="center"/>
+              <w:rPr>
+                <w:rFonts w:ascii="Times New Roman" w:hAnsi="Times New Roman" w:cs="Times New Roman"/>
+                <w:lang w:val="en-US"/>
+              </w:rPr>
+            </w:pPr>
+          </w:p>
+        </w:tc>
+        <w:tc>
+          <w:tcPr>
+            <w:tcW w:w="2224" w:type="dxa"/>
+          </w:tcPr>
+          <w:p>
+            <w:pPr>
+              <w:jc w:val="center"/>
+              <w:rPr>
+                <w:rFonts w:ascii="Times New Roman" w:hAnsi="Times New Roman" w:cs="Times New Roman"/>
+                <w:lang w:val="en-US"/>
+              </w:rPr>
+            </w:pPr>
+          </w:p>
+        </w:tc>
+      </w:tr>
+      <w:bookmarkEnd w:id="4"/>
+    </w:tbl>
+    <w:p>
+      <w:pPr>
+        <w:jc w:val="both"/>
+        <w:rPr>
+          <w:rFonts w:ascii="Times New Roman" w:hAnsi="Times New Roman" w:cs="Times New Roman"/>
+          <w:sz w:val="28"/>
+          <w:szCs w:val="28"/>
+          <w:lang w:val="en-US"/>
+        </w:rPr>
+      </w:pPr>
+    </w:p>
+    <w:p>
+      <w:pPr>
+        <w:pStyle w:val="a7"/>
+        <w:numPr>
+          <w:ilvl w:val="0"/>
+          <w:numId w:val="8"/>
+        </w:numPr>
+        <w:jc w:val="both"/>
+        <w:rPr>
+          <w:rFonts w:ascii="Times New Roman" w:hAnsi="Times New Roman" w:cs="Times New Roman"/>
+          <w:sz w:val="28"/>
+          <w:szCs w:val="28"/>
+          <w:lang w:val="en-US"/>
+        </w:rPr>
+      </w:pPr>
+      <w:r>
+        <w:rPr>
+          <w:rFonts w:ascii="Times New Roman" w:hAnsi="Times New Roman" w:cs="Times New Roman"/>
+          <w:sz w:val="28"/>
+          <w:szCs w:val="28"/>
+          <w:lang w:val="en-US"/>
+        </w:rPr>
+        <w:t xml:space="preserve">Converting </w:t>
+      </w:r>
+      <w:r>
+        <w:rPr>
+          <w:rFonts w:ascii="Times New Roman" w:hAnsi="Times New Roman" w:cs="Times New Roman"/>
+          <w:sz w:val="28"/>
+          <w:szCs w:val="28"/>
+          <w:lang w:val="en-US"/>
+        </w:rPr>
+        <w:t>integer</w:t>
+      </w:r>
+      <w:r>
+        <w:rPr>
+          <w:rFonts w:ascii="Times New Roman" w:hAnsi="Times New Roman" w:cs="Times New Roman"/>
+          <w:sz w:val="28"/>
+          <w:szCs w:val="28"/>
+          <w:lang w:val="en-US"/>
+        </w:rPr>
+        <w:t xml:space="preserve"> from reference number</w:t>
+      </w:r>
+    </w:p>
+    <w:tbl>
+      <w:tblPr>
+        <w:tblStyle w:val="a8"/>
+        <w:tblW w:w="0" w:type="auto"/>
+        <w:tblLook w:val="04A0" w:firstRow="1" w:lastRow="0" w:firstColumn="1" w:lastColumn="0" w:noHBand="0" w:noVBand="1"/>
+      </w:tblPr>
+      <w:tblGrid>
+        <w:gridCol w:w="1834"/>
+        <w:gridCol w:w="1841"/>
+        <w:gridCol w:w="1416"/>
+        <w:gridCol w:w="1696"/>
+        <w:gridCol w:w="1189"/>
+        <w:gridCol w:w="2219"/>
+      </w:tblGrid>
+      <w:tr>
+        <w:trPr>
+          <w:trHeight w:val="787"/>
+        </w:trPr>
+        <w:tc>
+          <w:tcPr>
+            <w:tcW w:w="1838" w:type="dxa"/>
+          </w:tcPr>
+          <w:p>
+            <w:pPr>
+              <w:jc w:val="center"/>
+              <w:rPr>
+                <w:rFonts w:ascii="Times New Roman" w:hAnsi="Times New Roman" w:cs="Times New Roman"/>
+                <w:b/>
+                <w:bCs/>
+                <w:sz w:val="24"/>
+                <w:szCs w:val="24"/>
+                <w:lang w:val="en-US"/>
+              </w:rPr>
+            </w:pPr>
+            <w:bookmarkStart w:id="5" w:name="IntegerConvertingRefNumber"/>
+            <w:r>
+              <w:rPr>
+                <w:rFonts w:ascii="Times New Roman" w:hAnsi="Times New Roman" w:cs="Times New Roman"/>
+                <w:b/>
+                <w:bCs/>
+                <w:sz w:val="24"/>
+                <w:szCs w:val="24"/>
+                <w:lang w:val="en-US"/>
+              </w:rPr>
+              <w:t>Input value</w:t>
+            </w:r>
+          </w:p>
+        </w:tc>
+        <w:tc>
+          <w:tcPr>
+            <w:tcW w:w="1843" w:type="dxa"/>
+          </w:tcPr>
+          <w:p>
+            <w:pPr>
+              <w:jc w:val="center"/>
+              <w:rPr>
+                <w:rFonts w:ascii="Times New Roman" w:hAnsi="Times New Roman" w:cs="Times New Roman"/>
+                <w:b/>
+                <w:bCs/>
+                <w:sz w:val="24"/>
+                <w:szCs w:val="24"/>
+                <w:lang w:val="en-US"/>
+              </w:rPr>
+            </w:pPr>
+            <w:r>
+              <w:rPr>
+                <w:rFonts w:ascii="Times New Roman" w:hAnsi="Times New Roman" w:cs="Times New Roman"/>
+                <w:b/>
+                <w:bCs/>
+                <w:sz w:val="24"/>
+                <w:szCs w:val="24"/>
+                <w:lang w:val="en-US"/>
+              </w:rPr>
+              <w:t>Reference number</w:t>
+            </w:r>
+          </w:p>
+        </w:tc>
+        <w:tc>
+          <w:tcPr>
+            <w:tcW w:w="1416" w:type="dxa"/>
+          </w:tcPr>
+          <w:p>
+            <w:pPr>
+              <w:jc w:val="center"/>
+              <w:rPr>
+                <w:rFonts w:ascii="Times New Roman" w:hAnsi="Times New Roman" w:cs="Times New Roman"/>
+                <w:b/>
+                <w:bCs/>
+                <w:sz w:val="24"/>
+                <w:szCs w:val="24"/>
+                <w:lang w:val="en-US"/>
+              </w:rPr>
+            </w:pPr>
+            <w:r>
+              <w:rPr>
+                <w:rFonts w:ascii="Times New Roman" w:hAnsi="Times New Roman" w:cs="Times New Roman"/>
+                <w:b/>
+                <w:bCs/>
+                <w:sz w:val="24"/>
+                <w:szCs w:val="24"/>
+                <w:lang w:val="en-US"/>
+              </w:rPr>
+              <w:t>Resolution</w:t>
+            </w:r>
+          </w:p>
+        </w:tc>
+        <w:tc>
+          <w:tcPr>
+            <w:tcW w:w="1699" w:type="dxa"/>
+          </w:tcPr>
+          <w:p>
+            <w:pPr>
+              <w:jc w:val="center"/>
+              <w:rPr>
+                <w:rFonts w:ascii="Times New Roman" w:hAnsi="Times New Roman" w:cs="Times New Roman"/>
+                <w:b/>
+                <w:bCs/>
+                <w:sz w:val="24"/>
+                <w:szCs w:val="24"/>
+                <w:lang w:val="en-US"/>
+              </w:rPr>
+            </w:pPr>
+            <w:r>
+              <w:rPr>
+                <w:rFonts w:ascii="Times New Roman" w:hAnsi="Times New Roman" w:cs="Times New Roman"/>
+                <w:b/>
+                <w:bCs/>
+                <w:sz w:val="24"/>
+                <w:szCs w:val="24"/>
+                <w:lang w:val="en-US"/>
+              </w:rPr>
+              <w:t>Prefix</w:t>
+            </w:r>
+          </w:p>
+        </w:tc>
+        <w:tc>
+          <w:tcPr>
+            <w:tcW w:w="1175" w:type="dxa"/>
+          </w:tcPr>
+          <w:p>
+            <w:pPr>
+              <w:jc w:val="center"/>
+              <w:rPr>
+                <w:rFonts w:ascii="Times New Roman" w:hAnsi="Times New Roman" w:cs="Times New Roman"/>
+                <w:b/>
+                <w:bCs/>
+                <w:sz w:val="24"/>
+                <w:szCs w:val="24"/>
+                <w:lang w:val="en-US"/>
+              </w:rPr>
+            </w:pPr>
+            <w:r>
+              <w:rPr>
+                <w:rFonts w:ascii="Times New Roman" w:hAnsi="Times New Roman" w:cs="Times New Roman"/>
+                <w:b/>
+                <w:bCs/>
+                <w:sz w:val="24"/>
+                <w:szCs w:val="24"/>
+                <w:lang w:val="en-US"/>
+              </w:rPr>
+              <w:t>Delimiter</w:t>
+            </w:r>
+          </w:p>
+        </w:tc>
+        <w:tc>
+          <w:tcPr>
+            <w:tcW w:w="2224" w:type="dxa"/>
+          </w:tcPr>
+          <w:p>
+            <w:pPr>
+              <w:jc w:val="center"/>
+              <w:rPr>
+                <w:rFonts w:ascii="Times New Roman" w:hAnsi="Times New Roman" w:cs="Times New Roman"/>
+                <w:b/>
+                <w:bCs/>
+                <w:sz w:val="24"/>
+                <w:szCs w:val="24"/>
+                <w:lang w:val="en-US"/>
+              </w:rPr>
+            </w:pPr>
+            <w:r>
+              <w:rPr>
+                <w:rFonts w:ascii="Times New Roman" w:hAnsi="Times New Roman" w:cs="Times New Roman"/>
+                <w:b/>
+                <w:bCs/>
+                <w:sz w:val="24"/>
+                <w:szCs w:val="24"/>
+                <w:lang w:val="en-US"/>
+              </w:rPr>
+              <w:t>Output value</w:t>
+            </w:r>
+          </w:p>
+        </w:tc>
+      </w:tr>
+      <w:tr>
+        <w:tc>
+          <w:tcPr>
+            <w:tcW w:w="1838" w:type="dxa"/>
+          </w:tcPr>
+          <w:p>
+            <w:pPr>
+              <w:jc w:val="center"/>
+              <w:rPr>
+                <w:rFonts w:ascii="Times New Roman" w:hAnsi="Times New Roman" w:cs="Times New Roman"/>
+                <w:lang w:val="en-US"/>
+              </w:rPr>
+            </w:pPr>
+          </w:p>
+        </w:tc>
+        <w:tc>
+          <w:tcPr>
+            <w:tcW w:w="1843" w:type="dxa"/>
+          </w:tcPr>
+          <w:p>
+            <w:pPr>
+              <w:jc w:val="center"/>
+              <w:rPr>
+                <w:rFonts w:ascii="Times New Roman" w:hAnsi="Times New Roman" w:cs="Times New Roman"/>
+                <w:lang w:val="en-US"/>
+              </w:rPr>
+            </w:pPr>
+          </w:p>
+        </w:tc>
+        <w:tc>
+          <w:tcPr>
+            <w:tcW w:w="1416" w:type="dxa"/>
+          </w:tcPr>
+          <w:p>
+            <w:pPr>
+              <w:jc w:val="center"/>
+              <w:rPr>
+                <w:rFonts w:ascii="Times New Roman" w:hAnsi="Times New Roman" w:cs="Times New Roman"/>
+                <w:lang w:val="en-US"/>
+              </w:rPr>
+            </w:pPr>
+          </w:p>
+        </w:tc>
+        <w:tc>
+          <w:tcPr>
+            <w:tcW w:w="1699" w:type="dxa"/>
+          </w:tcPr>
+          <w:p>
+            <w:pPr>
+              <w:jc w:val="center"/>
+              <w:rPr>
+                <w:rFonts w:ascii="Times New Roman" w:hAnsi="Times New Roman" w:cs="Times New Roman"/>
+                <w:lang w:val="en-US"/>
+              </w:rPr>
+            </w:pPr>
+          </w:p>
+        </w:tc>
+        <w:tc>
+          <w:tcPr>
+            <w:tcW w:w="1175" w:type="dxa"/>
+          </w:tcPr>
+          <w:p>
+            <w:pPr>
+              <w:jc w:val="center"/>
+              <w:rPr>
+                <w:rFonts w:ascii="Times New Roman" w:hAnsi="Times New Roman" w:cs="Times New Roman"/>
+                <w:lang w:val="en-US"/>
+              </w:rPr>
+            </w:pPr>
+          </w:p>
+        </w:tc>
+        <w:tc>
+          <w:tcPr>
+            <w:tcW w:w="2224" w:type="dxa"/>
+          </w:tcPr>
+          <w:p>
+            <w:pPr>
+              <w:jc w:val="center"/>
+              <w:rPr>
+                <w:rFonts w:ascii="Times New Roman" w:hAnsi="Times New Roman" w:cs="Times New Roman"/>
+                <w:lang w:val="en-US"/>
+              </w:rPr>
+            </w:pPr>
+          </w:p>
+        </w:tc>
+      </w:tr>
+      <w:bookmarkEnd w:id="5"/>
+    </w:tbl>
+    <w:p>
+      <w:pPr>
+        <w:jc w:val="both"/>
+        <w:rPr>
+          <w:rFonts w:ascii="Times New Roman" w:hAnsi="Times New Roman" w:cs="Times New Roman"/>
+          <w:sz w:val="28"/>
+          <w:szCs w:val="28"/>
+          <w:lang w:val="en-US"/>
+        </w:rPr>
+      </w:pPr>
+    </w:p>
+    <w:p>
+      <w:pPr>
+        <w:pStyle w:val="a7"/>
+        <w:numPr>
+          <w:ilvl w:val="0"/>
+          <w:numId w:val="8"/>
+        </w:numPr>
+        <w:jc w:val="both"/>
+        <w:rPr>
+          <w:rFonts w:ascii="Times New Roman" w:hAnsi="Times New Roman" w:cs="Times New Roman"/>
+          <w:sz w:val="28"/>
+          <w:szCs w:val="28"/>
+          <w:lang w:val="en-US"/>
+        </w:rPr>
+      </w:pPr>
+      <w:r>
+        <w:rPr>
+          <w:rFonts w:ascii="Times New Roman" w:hAnsi="Times New Roman" w:cs="Times New Roman"/>
+          <w:sz w:val="28"/>
+          <w:szCs w:val="28"/>
+          <w:lang w:val="en-US"/>
+        </w:rPr>
+        <w:t>Converting string from reference number</w:t>
+      </w:r>
+      <w:r>
+        <w:rPr>
+          <w:rFonts w:ascii="Times New Roman" w:hAnsi="Times New Roman" w:cs="Times New Roman"/>
+          <w:sz w:val="28"/>
+          <w:szCs w:val="28"/>
+          <w:lang w:val="en-US"/>
+        </w:rPr>
+        <w:t xml:space="preserve"> and resolution</w:t>
+      </w:r>
+    </w:p>
+    <w:tbl>
+      <w:tblPr>
+        <w:tblStyle w:val="a8"/>
+        <w:tblW w:w="0" w:type="auto"/>
+        <w:tblLook w:val="04A0" w:firstRow="1" w:lastRow="0" w:firstColumn="1" w:lastColumn="0" w:noHBand="0" w:noVBand="1"/>
+      </w:tblPr>
+      <w:tblGrid>
+        <w:gridCol w:w="1834"/>
+        <w:gridCol w:w="1841"/>
+        <w:gridCol w:w="1416"/>
+        <w:gridCol w:w="1696"/>
+        <w:gridCol w:w="1189"/>
+        <w:gridCol w:w="2219"/>
+      </w:tblGrid>
+      <w:tr>
+        <w:trPr>
+          <w:trHeight w:val="787"/>
+        </w:trPr>
+        <w:tc>
+          <w:tcPr>
+            <w:tcW w:w="1838" w:type="dxa"/>
+          </w:tcPr>
+          <w:p>
+            <w:pPr>
+              <w:jc w:val="center"/>
+              <w:rPr>
+                <w:rFonts w:ascii="Times New Roman" w:hAnsi="Times New Roman" w:cs="Times New Roman"/>
+                <w:b/>
+                <w:bCs/>
+                <w:sz w:val="24"/>
+                <w:szCs w:val="24"/>
+                <w:lang w:val="en-US"/>
+              </w:rPr>
+            </w:pPr>
+            <w:bookmarkStart w:id="6" w:name="ConvertingRefNumberRes"/>
+            <w:r>
+              <w:rPr>
+                <w:rFonts w:ascii="Times New Roman" w:hAnsi="Times New Roman" w:cs="Times New Roman"/>
+                <w:b/>
+                <w:bCs/>
+                <w:sz w:val="24"/>
+                <w:szCs w:val="24"/>
+                <w:lang w:val="en-US"/>
+              </w:rPr>
+              <w:t>Input value</w:t>
+            </w:r>
+          </w:p>
+        </w:tc>
+        <w:tc>
+          <w:tcPr>
+            <w:tcW w:w="1843" w:type="dxa"/>
+          </w:tcPr>
+          <w:p>
+            <w:pPr>
+              <w:jc w:val="center"/>
+              <w:rPr>
+                <w:rFonts w:ascii="Times New Roman" w:hAnsi="Times New Roman" w:cs="Times New Roman"/>
+                <w:b/>
+                <w:bCs/>
+                <w:sz w:val="24"/>
+                <w:szCs w:val="24"/>
+                <w:lang w:val="en-US"/>
+              </w:rPr>
+            </w:pPr>
+            <w:r>
+              <w:rPr>
+                <w:rFonts w:ascii="Times New Roman" w:hAnsi="Times New Roman" w:cs="Times New Roman"/>
+                <w:b/>
+                <w:bCs/>
+                <w:sz w:val="24"/>
+                <w:szCs w:val="24"/>
+                <w:lang w:val="en-US"/>
+              </w:rPr>
+              <w:t>Reference number</w:t>
+            </w:r>
+          </w:p>
+        </w:tc>
+        <w:tc>
+          <w:tcPr>
+            <w:tcW w:w="1416" w:type="dxa"/>
+          </w:tcPr>
+          <w:p>
+            <w:pPr>
+              <w:jc w:val="center"/>
+              <w:rPr>
+                <w:rFonts w:ascii="Times New Roman" w:hAnsi="Times New Roman" w:cs="Times New Roman"/>
+                <w:b/>
+                <w:bCs/>
+                <w:sz w:val="24"/>
+                <w:szCs w:val="24"/>
+                <w:lang w:val="en-US"/>
+              </w:rPr>
+            </w:pPr>
+            <w:r>
+              <w:rPr>
+                <w:rFonts w:ascii="Times New Roman" w:hAnsi="Times New Roman" w:cs="Times New Roman"/>
+                <w:b/>
+                <w:bCs/>
+                <w:sz w:val="24"/>
+                <w:szCs w:val="24"/>
+                <w:lang w:val="en-US"/>
+              </w:rPr>
+              <w:t>Resolution</w:t>
+            </w:r>
+          </w:p>
+        </w:tc>
+        <w:tc>
+          <w:tcPr>
+            <w:tcW w:w="1699" w:type="dxa"/>
+          </w:tcPr>
+          <w:p>
+            <w:pPr>
+              <w:jc w:val="center"/>
+              <w:rPr>
+                <w:rFonts w:ascii="Times New Roman" w:hAnsi="Times New Roman" w:cs="Times New Roman"/>
+                <w:b/>
+                <w:bCs/>
+                <w:sz w:val="24"/>
+                <w:szCs w:val="24"/>
+                <w:lang w:val="en-US"/>
+              </w:rPr>
+            </w:pPr>
+            <w:r>
+              <w:rPr>
+                <w:rFonts w:ascii="Times New Roman" w:hAnsi="Times New Roman" w:cs="Times New Roman"/>
+                <w:b/>
+                <w:bCs/>
+                <w:sz w:val="24"/>
+                <w:szCs w:val="24"/>
+                <w:lang w:val="en-US"/>
+              </w:rPr>
+              <w:t>Prefix</w:t>
+            </w:r>
+          </w:p>
+        </w:tc>
+        <w:tc>
+          <w:tcPr>
+            <w:tcW w:w="1175" w:type="dxa"/>
+          </w:tcPr>
+          <w:p>
+            <w:pPr>
+              <w:jc w:val="center"/>
+              <w:rPr>
+                <w:rFonts w:ascii="Times New Roman" w:hAnsi="Times New Roman" w:cs="Times New Roman"/>
+                <w:b/>
+                <w:bCs/>
+                <w:sz w:val="24"/>
+                <w:szCs w:val="24"/>
+                <w:lang w:val="en-US"/>
+              </w:rPr>
+            </w:pPr>
+            <w:r>
+              <w:rPr>
+                <w:rFonts w:ascii="Times New Roman" w:hAnsi="Times New Roman" w:cs="Times New Roman"/>
+                <w:b/>
+                <w:bCs/>
+                <w:sz w:val="24"/>
+                <w:szCs w:val="24"/>
+                <w:lang w:val="en-US"/>
+              </w:rPr>
+              <w:t>Delimiter</w:t>
+            </w:r>
+          </w:p>
+        </w:tc>
+        <w:tc>
+          <w:tcPr>
+            <w:tcW w:w="2224" w:type="dxa"/>
+          </w:tcPr>
+          <w:p>
+            <w:pPr>
+              <w:jc w:val="center"/>
+              <w:rPr>
+                <w:rFonts w:ascii="Times New Roman" w:hAnsi="Times New Roman" w:cs="Times New Roman"/>
+                <w:b/>
+                <w:bCs/>
+                <w:sz w:val="24"/>
+                <w:szCs w:val="24"/>
+                <w:lang w:val="en-US"/>
+              </w:rPr>
+            </w:pPr>
+            <w:r>
+              <w:rPr>
+                <w:rFonts w:ascii="Times New Roman" w:hAnsi="Times New Roman" w:cs="Times New Roman"/>
+                <w:b/>
+                <w:bCs/>
+                <w:sz w:val="24"/>
+                <w:szCs w:val="24"/>
+                <w:lang w:val="en-US"/>
+              </w:rPr>
+              <w:t>Output value</w:t>
+            </w:r>
+          </w:p>
+        </w:tc>
+      </w:tr>
+      <w:tr>
+        <w:tc>
+          <w:tcPr>
+            <w:tcW w:w="1838" w:type="dxa"/>
+          </w:tcPr>
+          <w:p>
+            <w:pPr>
+              <w:jc w:val="center"/>
+              <w:rPr>
+                <w:rFonts w:ascii="Times New Roman" w:hAnsi="Times New Roman" w:cs="Times New Roman"/>
+                <w:lang w:val="en-US"/>
+              </w:rPr>
+            </w:pPr>
+          </w:p>
+        </w:tc>
+        <w:tc>
+          <w:tcPr>
+            <w:tcW w:w="1843" w:type="dxa"/>
+          </w:tcPr>
+          <w:p>
+            <w:pPr>
+              <w:jc w:val="center"/>
+              <w:rPr>
+                <w:rFonts w:ascii="Times New Roman" w:hAnsi="Times New Roman" w:cs="Times New Roman"/>
+                <w:lang w:val="en-US"/>
+              </w:rPr>
+            </w:pPr>
+          </w:p>
+        </w:tc>
+        <w:tc>
+          <w:tcPr>
+            <w:tcW w:w="1416" w:type="dxa"/>
+          </w:tcPr>
+          <w:p>
+            <w:pPr>
+              <w:jc w:val="center"/>
+              <w:rPr>
+                <w:rFonts w:ascii="Times New Roman" w:hAnsi="Times New Roman" w:cs="Times New Roman"/>
+                <w:lang w:val="en-US"/>
+              </w:rPr>
+            </w:pPr>
+          </w:p>
+        </w:tc>
+        <w:tc>
+          <w:tcPr>
+            <w:tcW w:w="1699" w:type="dxa"/>
+          </w:tcPr>
+          <w:p>
+            <w:pPr>
+              <w:jc w:val="center"/>
+              <w:rPr>
+                <w:rFonts w:ascii="Times New Roman" w:hAnsi="Times New Roman" w:cs="Times New Roman"/>
+                <w:lang w:val="en-US"/>
+              </w:rPr>
+            </w:pPr>
+          </w:p>
+        </w:tc>
+        <w:tc>
+          <w:tcPr>
+            <w:tcW w:w="1175" w:type="dxa"/>
+          </w:tcPr>
+          <w:p>
+            <w:pPr>
+              <w:jc w:val="center"/>
+              <w:rPr>
+                <w:rFonts w:ascii="Times New Roman" w:hAnsi="Times New Roman" w:cs="Times New Roman"/>
+                <w:lang w:val="en-US"/>
+              </w:rPr>
+            </w:pPr>
+          </w:p>
+        </w:tc>
+        <w:tc>
+          <w:tcPr>
+            <w:tcW w:w="2224" w:type="dxa"/>
+          </w:tcPr>
+          <w:p>
+            <w:pPr>
+              <w:jc w:val="center"/>
+              <w:rPr>
+                <w:rFonts w:ascii="Times New Roman" w:hAnsi="Times New Roman" w:cs="Times New Roman"/>
+                <w:lang w:val="en-US"/>
+              </w:rPr>
+            </w:pPr>
+          </w:p>
+        </w:tc>
+      </w:tr>
+      <w:bookmarkEnd w:id="6"/>
+    </w:tbl>
+    <w:p>
+      <w:pPr>
+        <w:jc w:val="both"/>
+        <w:rPr>
+          <w:rFonts w:ascii="Times New Roman" w:hAnsi="Times New Roman" w:cs="Times New Roman"/>
+          <w:sz w:val="28"/>
+          <w:szCs w:val="28"/>
+          <w:lang w:val="en-US"/>
+        </w:rPr>
+      </w:pPr>
+    </w:p>
+    <w:p>
+      <w:pPr>
+        <w:pStyle w:val="a7"/>
+        <w:numPr>
+          <w:ilvl w:val="0"/>
+          <w:numId w:val="8"/>
+        </w:numPr>
+        <w:jc w:val="both"/>
+        <w:rPr>
+          <w:rFonts w:ascii="Times New Roman" w:hAnsi="Times New Roman" w:cs="Times New Roman"/>
+          <w:sz w:val="28"/>
+          <w:szCs w:val="28"/>
+          <w:lang w:val="en-US"/>
+        </w:rPr>
+      </w:pPr>
+      <w:r>
+        <w:rPr>
+          <w:rFonts w:ascii="Times New Roman" w:hAnsi="Times New Roman" w:cs="Times New Roman"/>
+          <w:sz w:val="28"/>
+          <w:szCs w:val="28"/>
+          <w:lang w:val="en-US"/>
+        </w:rPr>
+        <w:t>Converting string from reference number</w:t>
+      </w:r>
+      <w:r>
+        <w:rPr>
+          <w:rFonts w:ascii="Times New Roman" w:hAnsi="Times New Roman" w:cs="Times New Roman"/>
+          <w:sz w:val="28"/>
+          <w:szCs w:val="28"/>
+          <w:lang w:val="en-US"/>
+        </w:rPr>
+        <w:t>,</w:t>
+      </w:r>
+      <w:r>
+        <w:rPr>
+          <w:rFonts w:ascii="Times New Roman" w:hAnsi="Times New Roman" w:cs="Times New Roman"/>
+          <w:sz w:val="28"/>
+          <w:szCs w:val="28"/>
+          <w:lang w:val="en-US"/>
+        </w:rPr>
+        <w:t xml:space="preserve"> resolution</w:t>
+      </w:r>
+      <w:r>
+        <w:rPr>
+          <w:rFonts w:ascii="Times New Roman" w:hAnsi="Times New Roman" w:cs="Times New Roman"/>
+          <w:sz w:val="28"/>
+          <w:szCs w:val="28"/>
+          <w:lang w:val="en-US"/>
+        </w:rPr>
+        <w:t xml:space="preserve"> and delimiter</w:t>
+      </w:r>
+    </w:p>
+    <w:tbl>
+      <w:tblPr>
+        <w:tblStyle w:val="a8"/>
+        <w:tblW w:w="0" w:type="auto"/>
+        <w:tblLook w:val="04A0" w:firstRow="1" w:lastRow="0" w:firstColumn="1" w:lastColumn="0" w:noHBand="0" w:noVBand="1"/>
+      </w:tblPr>
+      <w:tblGrid>
+        <w:gridCol w:w="1834"/>
+        <w:gridCol w:w="1841"/>
+        <w:gridCol w:w="1416"/>
+        <w:gridCol w:w="1696"/>
+        <w:gridCol w:w="1189"/>
+        <w:gridCol w:w="2219"/>
+      </w:tblGrid>
+      <w:tr>
+        <w:trPr>
+          <w:trHeight w:val="787"/>
+        </w:trPr>
+        <w:tc>
+          <w:tcPr>
+            <w:tcW w:w="1838" w:type="dxa"/>
+          </w:tcPr>
+          <w:p>
+            <w:pPr>
+              <w:jc w:val="center"/>
+              <w:rPr>
+                <w:rFonts w:ascii="Times New Roman" w:hAnsi="Times New Roman" w:cs="Times New Roman"/>
+                <w:b/>
+                <w:bCs/>
+                <w:sz w:val="24"/>
+                <w:szCs w:val="24"/>
+                <w:lang w:val="en-US"/>
+              </w:rPr>
+            </w:pPr>
+            <w:bookmarkStart w:id="7" w:name="ConvertingRefNumberResDel"/>
+            <w:r>
+              <w:rPr>
+                <w:rFonts w:ascii="Times New Roman" w:hAnsi="Times New Roman" w:cs="Times New Roman"/>
+                <w:b/>
+                <w:bCs/>
+                <w:sz w:val="24"/>
+                <w:szCs w:val="24"/>
+                <w:lang w:val="en-US"/>
+              </w:rPr>
+              <w:t>Input value</w:t>
+            </w:r>
+          </w:p>
+        </w:tc>
+        <w:tc>
+          <w:tcPr>
+            <w:tcW w:w="1843" w:type="dxa"/>
+          </w:tcPr>
+          <w:p>
+            <w:pPr>
+              <w:jc w:val="center"/>
+              <w:rPr>
+                <w:rFonts w:ascii="Times New Roman" w:hAnsi="Times New Roman" w:cs="Times New Roman"/>
+                <w:b/>
+                <w:bCs/>
+                <w:sz w:val="24"/>
+                <w:szCs w:val="24"/>
+                <w:lang w:val="en-US"/>
+              </w:rPr>
+            </w:pPr>
+            <w:r>
+              <w:rPr>
+                <w:rFonts w:ascii="Times New Roman" w:hAnsi="Times New Roman" w:cs="Times New Roman"/>
+                <w:b/>
+                <w:bCs/>
+                <w:sz w:val="24"/>
+                <w:szCs w:val="24"/>
+                <w:lang w:val="en-US"/>
+              </w:rPr>
+              <w:t>Reference number</w:t>
+            </w:r>
+          </w:p>
+        </w:tc>
+        <w:tc>
+          <w:tcPr>
+            <w:tcW w:w="1416" w:type="dxa"/>
+          </w:tcPr>
+          <w:p>
+            <w:pPr>
+              <w:jc w:val="center"/>
+              <w:rPr>
+                <w:rFonts w:ascii="Times New Roman" w:hAnsi="Times New Roman" w:cs="Times New Roman"/>
+                <w:b/>
+                <w:bCs/>
+                <w:sz w:val="24"/>
+                <w:szCs w:val="24"/>
+                <w:lang w:val="en-US"/>
+              </w:rPr>
+            </w:pPr>
+            <w:r>
+              <w:rPr>
+                <w:rFonts w:ascii="Times New Roman" w:hAnsi="Times New Roman" w:cs="Times New Roman"/>
+                <w:b/>
+                <w:bCs/>
+                <w:sz w:val="24"/>
+                <w:szCs w:val="24"/>
+                <w:lang w:val="en-US"/>
+              </w:rPr>
+              <w:t>Resolution</w:t>
+            </w:r>
+          </w:p>
+        </w:tc>
+        <w:tc>
+          <w:tcPr>
+            <w:tcW w:w="1699" w:type="dxa"/>
+          </w:tcPr>
+          <w:p>
+            <w:pPr>
+              <w:jc w:val="center"/>
+              <w:rPr>
+                <w:rFonts w:ascii="Times New Roman" w:hAnsi="Times New Roman" w:cs="Times New Roman"/>
+                <w:b/>
+                <w:bCs/>
+                <w:sz w:val="24"/>
+                <w:szCs w:val="24"/>
+                <w:lang w:val="en-US"/>
+              </w:rPr>
+            </w:pPr>
+            <w:r>
+              <w:rPr>
+                <w:rFonts w:ascii="Times New Roman" w:hAnsi="Times New Roman" w:cs="Times New Roman"/>
+                <w:b/>
+                <w:bCs/>
+                <w:sz w:val="24"/>
+                <w:szCs w:val="24"/>
+                <w:lang w:val="en-US"/>
+              </w:rPr>
+              <w:t>Prefix</w:t>
+            </w:r>
+          </w:p>
+        </w:tc>
+        <w:tc>
+          <w:tcPr>
+            <w:tcW w:w="1175" w:type="dxa"/>
+          </w:tcPr>
+          <w:p>
+            <w:pPr>
+              <w:jc w:val="center"/>
+              <w:rPr>
+                <w:rFonts w:ascii="Times New Roman" w:hAnsi="Times New Roman" w:cs="Times New Roman"/>
+                <w:b/>
+                <w:bCs/>
+                <w:sz w:val="24"/>
+                <w:szCs w:val="24"/>
+                <w:lang w:val="en-US"/>
+              </w:rPr>
+            </w:pPr>
+            <w:r>
+              <w:rPr>
+                <w:rFonts w:ascii="Times New Roman" w:hAnsi="Times New Roman" w:cs="Times New Roman"/>
+                <w:b/>
+                <w:bCs/>
+                <w:sz w:val="24"/>
+                <w:szCs w:val="24"/>
+                <w:lang w:val="en-US"/>
+              </w:rPr>
+              <w:t>Delimiter</w:t>
+            </w:r>
+          </w:p>
+        </w:tc>
+        <w:tc>
+          <w:tcPr>
+            <w:tcW w:w="2224" w:type="dxa"/>
+          </w:tcPr>
+          <w:p>
+            <w:pPr>
+              <w:jc w:val="center"/>
+              <w:rPr>
+                <w:rFonts w:ascii="Times New Roman" w:hAnsi="Times New Roman" w:cs="Times New Roman"/>
+                <w:b/>
+                <w:bCs/>
+                <w:sz w:val="24"/>
+                <w:szCs w:val="24"/>
+                <w:lang w:val="en-US"/>
+              </w:rPr>
+            </w:pPr>
+            <w:r>
+              <w:rPr>
+                <w:rFonts w:ascii="Times New Roman" w:hAnsi="Times New Roman" w:cs="Times New Roman"/>
+                <w:b/>
+                <w:bCs/>
+                <w:sz w:val="24"/>
+                <w:szCs w:val="24"/>
+                <w:lang w:val="en-US"/>
+              </w:rPr>
+              <w:t>Output value</w:t>
+            </w:r>
+          </w:p>
+        </w:tc>
+      </w:tr>
+      <w:tr>
+        <w:tc>
+          <w:tcPr>
+            <w:tcW w:w="1838" w:type="dxa"/>
+          </w:tcPr>
+          <w:p>
+            <w:pPr>
+              <w:jc w:val="center"/>
+              <w:rPr>
+                <w:rFonts w:ascii="Times New Roman" w:hAnsi="Times New Roman" w:cs="Times New Roman"/>
+                <w:lang w:val="en-US"/>
+              </w:rPr>
+            </w:pPr>
+          </w:p>
+        </w:tc>
+        <w:tc>
+          <w:tcPr>
+            <w:tcW w:w="1843" w:type="dxa"/>
+          </w:tcPr>
+          <w:p>
+            <w:pPr>
+              <w:jc w:val="center"/>
+              <w:rPr>
+                <w:rFonts w:ascii="Times New Roman" w:hAnsi="Times New Roman" w:cs="Times New Roman"/>
+                <w:lang w:val="en-US"/>
+              </w:rPr>
+            </w:pPr>
+          </w:p>
+        </w:tc>
+        <w:tc>
+          <w:tcPr>
+            <w:tcW w:w="1416" w:type="dxa"/>
+          </w:tcPr>
+          <w:p>
+            <w:pPr>
+              <w:jc w:val="center"/>
+              <w:rPr>
+                <w:rFonts w:ascii="Times New Roman" w:hAnsi="Times New Roman" w:cs="Times New Roman"/>
+                <w:lang w:val="en-US"/>
+              </w:rPr>
+            </w:pPr>
+          </w:p>
+        </w:tc>
+        <w:tc>
+          <w:tcPr>
+            <w:tcW w:w="1699" w:type="dxa"/>
+          </w:tcPr>
+          <w:p>
+            <w:pPr>
+              <w:jc w:val="center"/>
+              <w:rPr>
+                <w:rFonts w:ascii="Times New Roman" w:hAnsi="Times New Roman" w:cs="Times New Roman"/>
+                <w:lang w:val="en-US"/>
+              </w:rPr>
+            </w:pPr>
+          </w:p>
+        </w:tc>
+        <w:tc>
+          <w:tcPr>
+            <w:tcW w:w="1175" w:type="dxa"/>
+          </w:tcPr>
+          <w:p>
+            <w:pPr>
+              <w:jc w:val="center"/>
+              <w:rPr>
+                <w:rFonts w:ascii="Times New Roman" w:hAnsi="Times New Roman" w:cs="Times New Roman"/>
+                <w:lang w:val="en-US"/>
+              </w:rPr>
+            </w:pPr>
+          </w:p>
+        </w:tc>
+        <w:tc>
+          <w:tcPr>
+            <w:tcW w:w="2224" w:type="dxa"/>
+          </w:tcPr>
+          <w:p>
+            <w:pPr>
+              <w:jc w:val="center"/>
+              <w:rPr>
+                <w:rFonts w:ascii="Times New Roman" w:hAnsi="Times New Roman" w:cs="Times New Roman"/>
+                <w:lang w:val="en-US"/>
+              </w:rPr>
+            </w:pPr>
+          </w:p>
+        </w:tc>
+      </w:tr>
+      <w:bookmarkEnd w:id="7"/>
+    </w:tbl>
+    <w:p>
+      <w:pPr>
+        <w:jc w:val="both"/>
+        <w:rPr>
+          <w:rFonts w:ascii="Times New Roman" w:hAnsi="Times New Roman" w:cs="Times New Roman"/>
+          <w:sz w:val="28"/>
+          <w:szCs w:val="28"/>
+          <w:lang w:val="en-US"/>
+        </w:rPr>
+      </w:pPr>
+    </w:p>
+    <w:p>
+      <w:pPr>
+        <w:pStyle w:val="a7"/>
+        <w:numPr>
+          <w:ilvl w:val="0"/>
+          <w:numId w:val="8"/>
+        </w:numPr>
+        <w:jc w:val="both"/>
+        <w:rPr>
+          <w:rFonts w:ascii="Times New Roman" w:hAnsi="Times New Roman" w:cs="Times New Roman"/>
+          <w:sz w:val="28"/>
+          <w:szCs w:val="28"/>
+          <w:lang w:val="en-US"/>
+        </w:rPr>
+      </w:pPr>
+      <w:r>
+        <w:rPr>
+          <w:rFonts w:ascii="Times New Roman" w:hAnsi="Times New Roman" w:cs="Times New Roman"/>
+          <w:sz w:val="28"/>
+          <w:szCs w:val="28"/>
+          <w:lang w:val="en-US"/>
+        </w:rPr>
+        <w:t>Converting string from reference number</w:t>
+      </w:r>
+      <w:r>
+        <w:rPr>
+          <w:rFonts w:ascii="Times New Roman" w:hAnsi="Times New Roman" w:cs="Times New Roman"/>
+          <w:sz w:val="28"/>
+          <w:szCs w:val="28"/>
+          <w:lang w:val="en-US"/>
+        </w:rPr>
+        <w:t xml:space="preserve">, </w:t>
+      </w:r>
+      <w:r>
+        <w:rPr>
+          <w:rFonts w:ascii="Times New Roman" w:hAnsi="Times New Roman" w:cs="Times New Roman"/>
+          <w:sz w:val="28"/>
+          <w:szCs w:val="28"/>
+          <w:lang w:val="en-US"/>
+        </w:rPr>
+        <w:t>resolution</w:t>
+      </w:r>
+      <w:r>
+        <w:rPr>
+          <w:rFonts w:ascii="Times New Roman" w:hAnsi="Times New Roman" w:cs="Times New Roman"/>
+          <w:sz w:val="28"/>
+          <w:szCs w:val="28"/>
+          <w:lang w:val="en-US"/>
+        </w:rPr>
+        <w:t>, delimiter and prefix</w:t>
+      </w:r>
+    </w:p>
+    <w:tbl>
+      <w:tblPr>
+        <w:tblStyle w:val="a8"/>
+        <w:tblW w:w="0" w:type="auto"/>
+        <w:tblLook w:val="04A0" w:firstRow="1" w:lastRow="0" w:firstColumn="1" w:lastColumn="0" w:noHBand="0" w:noVBand="1"/>
+      </w:tblPr>
+      <w:tblGrid>
+        <w:gridCol w:w="1834"/>
+        <w:gridCol w:w="1841"/>
+        <w:gridCol w:w="1416"/>
+        <w:gridCol w:w="1696"/>
+        <w:gridCol w:w="1189"/>
+        <w:gridCol w:w="2219"/>
+      </w:tblGrid>
+      <w:tr>
+        <w:trPr>
+          <w:trHeight w:val="787"/>
+        </w:trPr>
+        <w:tc>
+          <w:tcPr>
+            <w:tcW w:w="1838" w:type="dxa"/>
+          </w:tcPr>
+          <w:p>
+            <w:pPr>
+              <w:jc w:val="center"/>
+              <w:rPr>
+                <w:rFonts w:ascii="Times New Roman" w:hAnsi="Times New Roman" w:cs="Times New Roman"/>
+                <w:b/>
+                <w:bCs/>
+                <w:sz w:val="24"/>
+                <w:szCs w:val="24"/>
+                <w:lang w:val="en-US"/>
+              </w:rPr>
+            </w:pPr>
+            <w:bookmarkStart w:id="8" w:name="ConvertingRefNumberResDelPrefix"/>
+            <w:r>
+              <w:rPr>
+                <w:rFonts w:ascii="Times New Roman" w:hAnsi="Times New Roman" w:cs="Times New Roman"/>
+                <w:b/>
+                <w:bCs/>
+                <w:sz w:val="24"/>
+                <w:szCs w:val="24"/>
+                <w:lang w:val="en-US"/>
+              </w:rPr>
+              <w:t>Input value</w:t>
+            </w:r>
+          </w:p>
+        </w:tc>
+        <w:tc>
+          <w:tcPr>
+            <w:tcW w:w="1843" w:type="dxa"/>
+          </w:tcPr>
+          <w:p>
+            <w:pPr>
+              <w:jc w:val="center"/>
+              <w:rPr>
+                <w:rFonts w:ascii="Times New Roman" w:hAnsi="Times New Roman" w:cs="Times New Roman"/>
+                <w:b/>
+                <w:bCs/>
+                <w:sz w:val="24"/>
+                <w:szCs w:val="24"/>
+                <w:lang w:val="en-US"/>
+              </w:rPr>
+            </w:pPr>
+            <w:r>
+              <w:rPr>
+                <w:rFonts w:ascii="Times New Roman" w:hAnsi="Times New Roman" w:cs="Times New Roman"/>
+                <w:b/>
+                <w:bCs/>
+                <w:sz w:val="24"/>
+                <w:szCs w:val="24"/>
+                <w:lang w:val="en-US"/>
+              </w:rPr>
+              <w:t>Reference number</w:t>
+            </w:r>
+          </w:p>
+        </w:tc>
+        <w:tc>
+          <w:tcPr>
+            <w:tcW w:w="1416" w:type="dxa"/>
+          </w:tcPr>
+          <w:p>
+            <w:pPr>
+              <w:jc w:val="center"/>
+              <w:rPr>
+                <w:rFonts w:ascii="Times New Roman" w:hAnsi="Times New Roman" w:cs="Times New Roman"/>
+                <w:b/>
+                <w:bCs/>
+                <w:sz w:val="24"/>
+                <w:szCs w:val="24"/>
+                <w:lang w:val="en-US"/>
+              </w:rPr>
+            </w:pPr>
+            <w:r>
+              <w:rPr>
+                <w:rFonts w:ascii="Times New Roman" w:hAnsi="Times New Roman" w:cs="Times New Roman"/>
+                <w:b/>
+                <w:bCs/>
+                <w:sz w:val="24"/>
+                <w:szCs w:val="24"/>
+                <w:lang w:val="en-US"/>
+              </w:rPr>
+              <w:t>Resolution</w:t>
+            </w:r>
+          </w:p>
+        </w:tc>
+        <w:tc>
+          <w:tcPr>
+            <w:tcW w:w="1699" w:type="dxa"/>
+          </w:tcPr>
+          <w:p>
+            <w:pPr>
+              <w:jc w:val="center"/>
+              <w:rPr>
+                <w:rFonts w:ascii="Times New Roman" w:hAnsi="Times New Roman" w:cs="Times New Roman"/>
+                <w:b/>
+                <w:bCs/>
+                <w:sz w:val="24"/>
+                <w:szCs w:val="24"/>
+                <w:lang w:val="en-US"/>
+              </w:rPr>
+            </w:pPr>
+            <w:r>
+              <w:rPr>
+                <w:rFonts w:ascii="Times New Roman" w:hAnsi="Times New Roman" w:cs="Times New Roman"/>
+                <w:b/>
+                <w:bCs/>
+                <w:sz w:val="24"/>
+                <w:szCs w:val="24"/>
+                <w:lang w:val="en-US"/>
+              </w:rPr>
+              <w:t>Prefix</w:t>
+            </w:r>
+          </w:p>
+        </w:tc>
+        <w:tc>
+          <w:tcPr>
+            <w:tcW w:w="1175" w:type="dxa"/>
+          </w:tcPr>
+          <w:p>
+            <w:pPr>
+              <w:jc w:val="center"/>
+              <w:rPr>
+                <w:rFonts w:ascii="Times New Roman" w:hAnsi="Times New Roman" w:cs="Times New Roman"/>
+                <w:b/>
+                <w:bCs/>
+                <w:sz w:val="24"/>
+                <w:szCs w:val="24"/>
+                <w:lang w:val="en-US"/>
+              </w:rPr>
+            </w:pPr>
+            <w:r>
+              <w:rPr>
+                <w:rFonts w:ascii="Times New Roman" w:hAnsi="Times New Roman" w:cs="Times New Roman"/>
+                <w:b/>
+                <w:bCs/>
+                <w:sz w:val="24"/>
+                <w:szCs w:val="24"/>
+                <w:lang w:val="en-US"/>
+              </w:rPr>
+              <w:t>Delimiter</w:t>
+            </w:r>
+          </w:p>
+        </w:tc>
+        <w:tc>
+          <w:tcPr>
+            <w:tcW w:w="2224" w:type="dxa"/>
+          </w:tcPr>
+          <w:p>
+            <w:pPr>
+              <w:jc w:val="center"/>
+              <w:rPr>
+                <w:rFonts w:ascii="Times New Roman" w:hAnsi="Times New Roman" w:cs="Times New Roman"/>
+                <w:b/>
+                <w:bCs/>
+                <w:sz w:val="24"/>
+                <w:szCs w:val="24"/>
+                <w:lang w:val="en-US"/>
+              </w:rPr>
+            </w:pPr>
+            <w:r>
+              <w:rPr>
+                <w:rFonts w:ascii="Times New Roman" w:hAnsi="Times New Roman" w:cs="Times New Roman"/>
+                <w:b/>
+                <w:bCs/>
+                <w:sz w:val="24"/>
+                <w:szCs w:val="24"/>
+                <w:lang w:val="en-US"/>
+              </w:rPr>
+              <w:t>Output value</w:t>
+            </w:r>
+          </w:p>
+        </w:tc>
+      </w:tr>
+      <w:tr>
+        <w:tc>
+          <w:tcPr>
+            <w:tcW w:w="1838" w:type="dxa"/>
+          </w:tcPr>
+          <w:p>
+            <w:pPr>
+              <w:jc w:val="center"/>
+              <w:rPr>
+                <w:rFonts w:ascii="Times New Roman" w:hAnsi="Times New Roman" w:cs="Times New Roman"/>
+                <w:lang w:val="en-US"/>
+              </w:rPr>
+            </w:pPr>
+          </w:p>
+        </w:tc>
+        <w:tc>
+          <w:tcPr>
+            <w:tcW w:w="1843" w:type="dxa"/>
+          </w:tcPr>
+          <w:p>
+            <w:pPr>
+              <w:jc w:val="center"/>
+              <w:rPr>
+                <w:rFonts w:ascii="Times New Roman" w:hAnsi="Times New Roman" w:cs="Times New Roman"/>
+                <w:lang w:val="en-US"/>
+              </w:rPr>
+            </w:pPr>
+          </w:p>
+        </w:tc>
+        <w:tc>
+          <w:tcPr>
+            <w:tcW w:w="1416" w:type="dxa"/>
+          </w:tcPr>
+          <w:p>
+            <w:pPr>
+              <w:jc w:val="center"/>
+              <w:rPr>
+                <w:rFonts w:ascii="Times New Roman" w:hAnsi="Times New Roman" w:cs="Times New Roman"/>
+                <w:lang w:val="en-US"/>
+              </w:rPr>
+            </w:pPr>
+          </w:p>
+        </w:tc>
+        <w:tc>
+          <w:tcPr>
+            <w:tcW w:w="1699" w:type="dxa"/>
+          </w:tcPr>
+          <w:p>
+            <w:pPr>
+              <w:jc w:val="center"/>
+              <w:rPr>
+                <w:rFonts w:ascii="Times New Roman" w:hAnsi="Times New Roman" w:cs="Times New Roman"/>
+                <w:lang w:val="en-US"/>
+              </w:rPr>
+            </w:pPr>
+          </w:p>
+        </w:tc>
+        <w:tc>
+          <w:tcPr>
+            <w:tcW w:w="1175" w:type="dxa"/>
+          </w:tcPr>
+          <w:p>
+            <w:pPr>
+              <w:jc w:val="center"/>
+              <w:rPr>
+                <w:rFonts w:ascii="Times New Roman" w:hAnsi="Times New Roman" w:cs="Times New Roman"/>
+                <w:lang w:val="en-US"/>
+              </w:rPr>
+            </w:pPr>
+          </w:p>
+        </w:tc>
+        <w:tc>
+          <w:tcPr>
+            <w:tcW w:w="2224" w:type="dxa"/>
+          </w:tcPr>
+          <w:p>
+            <w:pPr>
+              <w:jc w:val="center"/>
+              <w:rPr>
+                <w:rFonts w:ascii="Times New Roman" w:hAnsi="Times New Roman" w:cs="Times New Roman"/>
+                <w:lang w:val="en-US"/>
+              </w:rPr>
+            </w:pPr>
+          </w:p>
+        </w:tc>
+      </w:tr>
+      <w:bookmarkEnd w:id="8"/>
+    </w:tbl>
+    <w:p>
+      <w:pPr>
+        <w:jc w:val="both"/>
+        <w:rPr>
+          <w:rFonts w:ascii="Times New Roman" w:hAnsi="Times New Roman" w:cs="Times New Roman"/>
+          <w:sz w:val="28"/>
+          <w:szCs w:val="28"/>
+          <w:lang w:val="en-US"/>
+        </w:rPr>
+      </w:pPr>
+    </w:p>
+    <w:p>
+      <w:pPr>
+        <w:pStyle w:val="a7"/>
+        <w:numPr>
+          <w:ilvl w:val="0"/>
+          <w:numId w:val="8"/>
+        </w:numPr>
+        <w:jc w:val="both"/>
+        <w:rPr>
+          <w:rFonts w:ascii="Times New Roman" w:hAnsi="Times New Roman" w:cs="Times New Roman"/>
+          <w:sz w:val="28"/>
+          <w:szCs w:val="28"/>
+          <w:lang w:val="en-US"/>
+        </w:rPr>
+      </w:pPr>
+      <w:r>
+        <w:rPr>
+          <w:rFonts w:ascii="Times New Roman" w:hAnsi="Times New Roman" w:cs="Times New Roman"/>
+          <w:sz w:val="28"/>
+          <w:szCs w:val="28"/>
+          <w:lang w:val="en-US"/>
+        </w:rPr>
+        <w:t>Converting string from resolution, delimiter and prefix</w:t>
+      </w:r>
+    </w:p>
+    <w:tbl>
+      <w:tblPr>
+        <w:tblStyle w:val="a8"/>
+        <w:tblW w:w="0" w:type="auto"/>
+        <w:tblLook w:val="04A0" w:firstRow="1" w:lastRow="0" w:firstColumn="1" w:lastColumn="0" w:noHBand="0" w:noVBand="1"/>
+      </w:tblPr>
+      <w:tblGrid>
+        <w:gridCol w:w="1834"/>
+        <w:gridCol w:w="1841"/>
+        <w:gridCol w:w="1416"/>
+        <w:gridCol w:w="1696"/>
+        <w:gridCol w:w="1189"/>
+        <w:gridCol w:w="2219"/>
+      </w:tblGrid>
+      <w:tr>
+        <w:trPr>
+          <w:trHeight w:val="787"/>
+        </w:trPr>
+        <w:tc>
+          <w:tcPr>
+            <w:tcW w:w="1838" w:type="dxa"/>
+          </w:tcPr>
+          <w:p>
+            <w:pPr>
+              <w:jc w:val="center"/>
+              <w:rPr>
+                <w:rFonts w:ascii="Times New Roman" w:hAnsi="Times New Roman" w:cs="Times New Roman"/>
+                <w:b/>
+                <w:bCs/>
+                <w:sz w:val="24"/>
+                <w:szCs w:val="24"/>
+                <w:lang w:val="en-US"/>
+              </w:rPr>
+            </w:pPr>
+            <w:bookmarkStart w:id="9" w:name="ConvertingValueResDelPrefix"/>
+            <w:r>
+              <w:rPr>
+                <w:rFonts w:ascii="Times New Roman" w:hAnsi="Times New Roman" w:cs="Times New Roman"/>
+                <w:b/>
+                <w:bCs/>
+                <w:sz w:val="24"/>
+                <w:szCs w:val="24"/>
+                <w:lang w:val="en-US"/>
+              </w:rPr>
+              <w:t>Input value</w:t>
+            </w:r>
+          </w:p>
+        </w:tc>
+        <w:tc>
+          <w:tcPr>
+            <w:tcW w:w="1843" w:type="dxa"/>
+          </w:tcPr>
+          <w:p>
+            <w:pPr>
+              <w:jc w:val="center"/>
+              <w:rPr>
+                <w:rFonts w:ascii="Times New Roman" w:hAnsi="Times New Roman" w:cs="Times New Roman"/>
+                <w:b/>
+                <w:bCs/>
+                <w:sz w:val="24"/>
+                <w:szCs w:val="24"/>
+                <w:lang w:val="en-US"/>
+              </w:rPr>
+            </w:pPr>
+            <w:r>
+              <w:rPr>
+                <w:rFonts w:ascii="Times New Roman" w:hAnsi="Times New Roman" w:cs="Times New Roman"/>
+                <w:b/>
+                <w:bCs/>
+                <w:sz w:val="24"/>
+                <w:szCs w:val="24"/>
+                <w:lang w:val="en-US"/>
+              </w:rPr>
+              <w:t>Reference number</w:t>
+            </w:r>
+          </w:p>
+        </w:tc>
+        <w:tc>
+          <w:tcPr>
+            <w:tcW w:w="1416" w:type="dxa"/>
+          </w:tcPr>
+          <w:p>
+            <w:pPr>
+              <w:jc w:val="center"/>
+              <w:rPr>
+                <w:rFonts w:ascii="Times New Roman" w:hAnsi="Times New Roman" w:cs="Times New Roman"/>
+                <w:b/>
+                <w:bCs/>
+                <w:sz w:val="24"/>
+                <w:szCs w:val="24"/>
+                <w:lang w:val="en-US"/>
+              </w:rPr>
+            </w:pPr>
+            <w:r>
+              <w:rPr>
+                <w:rFonts w:ascii="Times New Roman" w:hAnsi="Times New Roman" w:cs="Times New Roman"/>
+                <w:b/>
+                <w:bCs/>
+                <w:sz w:val="24"/>
+                <w:szCs w:val="24"/>
+                <w:lang w:val="en-US"/>
+              </w:rPr>
+              <w:t>Resolution</w:t>
+            </w:r>
+          </w:p>
+        </w:tc>
+        <w:tc>
+          <w:tcPr>
+            <w:tcW w:w="1699" w:type="dxa"/>
+          </w:tcPr>
+          <w:p>
+            <w:pPr>
+              <w:jc w:val="center"/>
+              <w:rPr>
+                <w:rFonts w:ascii="Times New Roman" w:hAnsi="Times New Roman" w:cs="Times New Roman"/>
+                <w:b/>
+                <w:bCs/>
+                <w:sz w:val="24"/>
+                <w:szCs w:val="24"/>
+                <w:lang w:val="en-US"/>
+              </w:rPr>
+            </w:pPr>
+            <w:r>
+              <w:rPr>
+                <w:rFonts w:ascii="Times New Roman" w:hAnsi="Times New Roman" w:cs="Times New Roman"/>
+                <w:b/>
+                <w:bCs/>
+                <w:sz w:val="24"/>
+                <w:szCs w:val="24"/>
+                <w:lang w:val="en-US"/>
+              </w:rPr>
+              <w:t>Prefix</w:t>
+            </w:r>
+          </w:p>
+        </w:tc>
+        <w:tc>
+          <w:tcPr>
+            <w:tcW w:w="1175" w:type="dxa"/>
+          </w:tcPr>
+          <w:p>
+            <w:pPr>
+              <w:jc w:val="center"/>
+              <w:rPr>
+                <w:rFonts w:ascii="Times New Roman" w:hAnsi="Times New Roman" w:cs="Times New Roman"/>
+                <w:b/>
+                <w:bCs/>
+                <w:sz w:val="24"/>
+                <w:szCs w:val="24"/>
+                <w:lang w:val="en-US"/>
+              </w:rPr>
+            </w:pPr>
+            <w:r>
+              <w:rPr>
+                <w:rFonts w:ascii="Times New Roman" w:hAnsi="Times New Roman" w:cs="Times New Roman"/>
+                <w:b/>
+                <w:bCs/>
+                <w:sz w:val="24"/>
+                <w:szCs w:val="24"/>
+                <w:lang w:val="en-US"/>
+              </w:rPr>
+              <w:t>Delimiter</w:t>
+            </w:r>
+          </w:p>
+        </w:tc>
+        <w:tc>
+          <w:tcPr>
+            <w:tcW w:w="2224" w:type="dxa"/>
+          </w:tcPr>
+          <w:p>
+            <w:pPr>
+              <w:jc w:val="center"/>
+              <w:rPr>
+                <w:rFonts w:ascii="Times New Roman" w:hAnsi="Times New Roman" w:cs="Times New Roman"/>
+                <w:b/>
+                <w:bCs/>
+                <w:sz w:val="24"/>
+                <w:szCs w:val="24"/>
+                <w:lang w:val="en-US"/>
+              </w:rPr>
+            </w:pPr>
+            <w:r>
+              <w:rPr>
+                <w:rFonts w:ascii="Times New Roman" w:hAnsi="Times New Roman" w:cs="Times New Roman"/>
+                <w:b/>
+                <w:bCs/>
+                <w:sz w:val="24"/>
+                <w:szCs w:val="24"/>
+                <w:lang w:val="en-US"/>
+              </w:rPr>
+              <w:t>Output value</w:t>
+            </w:r>
+          </w:p>
+        </w:tc>
+      </w:tr>
+      <w:tr>
+        <w:tc>
+          <w:tcPr>
+            <w:tcW w:w="1838" w:type="dxa"/>
+          </w:tcPr>
+          <w:p>
+            <w:pPr>
+              <w:jc w:val="center"/>
+              <w:rPr>
+                <w:rFonts w:ascii="Times New Roman" w:hAnsi="Times New Roman" w:cs="Times New Roman"/>
+                <w:lang w:val="en-US"/>
+              </w:rPr>
+            </w:pPr>
+          </w:p>
+        </w:tc>
+        <w:tc>
+          <w:tcPr>
+            <w:tcW w:w="1843" w:type="dxa"/>
+          </w:tcPr>
+          <w:p>
+            <w:pPr>
+              <w:jc w:val="center"/>
+              <w:rPr>
+                <w:rFonts w:ascii="Times New Roman" w:hAnsi="Times New Roman" w:cs="Times New Roman"/>
+                <w:lang w:val="en-US"/>
+              </w:rPr>
+            </w:pPr>
+          </w:p>
+        </w:tc>
+        <w:tc>
+          <w:tcPr>
+            <w:tcW w:w="1416" w:type="dxa"/>
+          </w:tcPr>
+          <w:p>
+            <w:pPr>
+              <w:jc w:val="center"/>
+              <w:rPr>
+                <w:rFonts w:ascii="Times New Roman" w:hAnsi="Times New Roman" w:cs="Times New Roman"/>
+                <w:lang w:val="en-US"/>
+              </w:rPr>
+            </w:pPr>
+          </w:p>
+        </w:tc>
+        <w:tc>
+          <w:tcPr>
+            <w:tcW w:w="1699" w:type="dxa"/>
+          </w:tcPr>
+          <w:p>
+            <w:pPr>
+              <w:jc w:val="center"/>
+              <w:rPr>
+                <w:rFonts w:ascii="Times New Roman" w:hAnsi="Times New Roman" w:cs="Times New Roman"/>
+                <w:lang w:val="en-US"/>
+              </w:rPr>
+            </w:pPr>
+          </w:p>
+        </w:tc>
+        <w:tc>
+          <w:tcPr>
+            <w:tcW w:w="1175" w:type="dxa"/>
+          </w:tcPr>
+          <w:p>
+            <w:pPr>
+              <w:jc w:val="center"/>
+              <w:rPr>
+                <w:rFonts w:ascii="Times New Roman" w:hAnsi="Times New Roman" w:cs="Times New Roman"/>
+                <w:lang w:val="en-US"/>
+              </w:rPr>
+            </w:pPr>
+          </w:p>
+        </w:tc>
+        <w:tc>
+          <w:tcPr>
+            <w:tcW w:w="2224" w:type="dxa"/>
+          </w:tcPr>
+          <w:p>
+            <w:pPr>
+              <w:jc w:val="center"/>
+              <w:rPr>
+                <w:rFonts w:ascii="Times New Roman" w:hAnsi="Times New Roman" w:cs="Times New Roman"/>
+                <w:lang w:val="en-US"/>
+              </w:rPr>
+            </w:pPr>
+          </w:p>
+        </w:tc>
+      </w:tr>
+      <w:bookmarkEnd w:id="9"/>
+    </w:tbl>
+    <w:p>
+      <w:pPr>
+        <w:jc w:val="both"/>
+        <w:rPr>
+          <w:rFonts w:ascii="Times New Roman" w:hAnsi="Times New Roman" w:cs="Times New Roman"/>
+          <w:sz w:val="28"/>
+          <w:szCs w:val="28"/>
           <w:lang w:val="en-US"/>
         </w:rPr>
       </w:pPr>
@@ -517,7 +3443,6 @@
         <w:color w:val="0070C0"/>
         <w:sz w:val="40"/>
         <w:szCs w:val="40"/>
-        <w:lang w:val="en-US"/>
       </w:rPr>
     </w:pPr>
     <w:r>
@@ -527,8 +3452,9 @@
         <w:color w:val="0070C0"/>
         <w:sz w:val="40"/>
         <w:szCs w:val="40"/>
+        <w:lang w:val="en-US"/>
       </w:rPr>
-      <w:t>_</w:t>
+      <w:t>__________________________________________________</w:t>
     </w:r>
     <w:r>
       <w:rPr>
@@ -537,20 +3463,8 @@
         <w:color w:val="0070C0"/>
         <w:sz w:val="40"/>
         <w:szCs w:val="40"/>
-        <w:lang w:val="en-US"/>
       </w:rPr>
-      <w:t>__________________________</w:t>
-    </w:r>
-    <w:r>
-      <w:rPr>
-        <w:b/>
-        <w:bCs/>
-        <w:color w:val="0070C0"/>
-        <w:sz w:val="40"/>
-        <w:szCs w:val="40"/>
-        <w:lang w:val="en-US"/>
-      </w:rPr>
-      <w:t>________________________</w:t>
+      <w:t>_</w:t>
     </w:r>
   </w:p>
   <w:p>
@@ -606,7 +3520,7 @@
         <wp:inline distT="0" distB="0" distL="0" distR="0" wp14:anchorId="38E5A320" wp14:editId="5CAFE4A1">
           <wp:extent cx="1549527" cy="466725"/>
           <wp:effectExtent l="0" t="0" r="0" b="0"/>
-          <wp:docPr id="7" name="Рисунок 7"/>
+          <wp:docPr id="3" name="Рисунок 3"/>
           <wp:cNvGraphicFramePr>
             <a:graphicFrameLocks xmlns:a="http://schemas.openxmlformats.org/drawingml/2006/main" noChangeAspect="1"/>
           </wp:cNvGraphicFramePr>
@@ -670,8 +3584,9 @@
         <w:color w:val="0070C0"/>
         <w:sz w:val="40"/>
         <w:szCs w:val="40"/>
+        <w:lang w:val="en-US"/>
       </w:rPr>
-      <w:t>_</w:t>
+      <w:t>__________________________________________________</w:t>
     </w:r>
     <w:r>
       <w:rPr>
@@ -680,21 +3595,21 @@
         <w:color w:val="0070C0"/>
         <w:sz w:val="40"/>
         <w:szCs w:val="40"/>
-        <w:lang w:val="en-US"/>
       </w:rPr>
-      <w:t>__________________________</w:t>
+      <w:t>_</w:t>
     </w:r>
-    <w:r>
+  </w:p>
+  <w:p>
+    <w:pPr>
+      <w:pStyle w:val="a3"/>
       <w:rPr>
         <w:b/>
         <w:bCs/>
         <w:color w:val="0070C0"/>
         <w:sz w:val="40"/>
         <w:szCs w:val="40"/>
-        <w:lang w:val="en-US"/>
       </w:rPr>
-      <w:t>________________________</w:t>
-    </w:r>
+    </w:pPr>
   </w:p>
 </w:hdr>
 </file>
@@ -791,6 +3706,95 @@
     </w:lvl>
   </w:abstractNum>
   <w:abstractNum w:abstractNumId="1" w15:restartNumberingAfterBreak="0">
+    <w:nsid w:val="0C9E2F72"/>
+    <w:multiLevelType w:val="hybridMultilevel"/>
+    <w:tmpl w:val="C30A08F4"/>
+    <w:lvl w:ilvl="0" w:tplc="7A326FBA">
+      <w:start w:val="1"/>
+      <w:numFmt w:val="upperLetter"/>
+      <w:lvlText w:val="%1)"/>
+      <w:lvlJc w:val="left"/>
+      <w:pPr>
+        <w:ind w:left="927" w:hanging="360"/>
+      </w:pPr>
+      <w:rPr>
+        <w:rFonts w:hint="default"/>
+      </w:rPr>
+    </w:lvl>
+    <w:lvl w:ilvl="1" w:tplc="04190019" w:tentative="1">
+      <w:start w:val="1"/>
+      <w:numFmt w:val="lowerLetter"/>
+      <w:lvlText w:val="%2."/>
+      <w:lvlJc w:val="left"/>
+      <w:pPr>
+        <w:ind w:left="1647" w:hanging="360"/>
+      </w:pPr>
+    </w:lvl>
+    <w:lvl w:ilvl="2" w:tplc="0419001B" w:tentative="1">
+      <w:start w:val="1"/>
+      <w:numFmt w:val="lowerRoman"/>
+      <w:lvlText w:val="%3."/>
+      <w:lvlJc w:val="right"/>
+      <w:pPr>
+        <w:ind w:left="2367" w:hanging="180"/>
+      </w:pPr>
+    </w:lvl>
+    <w:lvl w:ilvl="3" w:tplc="0419000F" w:tentative="1">
+      <w:start w:val="1"/>
+      <w:numFmt w:val="decimal"/>
+      <w:lvlText w:val="%4."/>
+      <w:lvlJc w:val="left"/>
+      <w:pPr>
+        <w:ind w:left="3087" w:hanging="360"/>
+      </w:pPr>
+    </w:lvl>
+    <w:lvl w:ilvl="4" w:tplc="04190019" w:tentative="1">
+      <w:start w:val="1"/>
+      <w:numFmt w:val="lowerLetter"/>
+      <w:lvlText w:val="%5."/>
+      <w:lvlJc w:val="left"/>
+      <w:pPr>
+        <w:ind w:left="3807" w:hanging="360"/>
+      </w:pPr>
+    </w:lvl>
+    <w:lvl w:ilvl="5" w:tplc="0419001B" w:tentative="1">
+      <w:start w:val="1"/>
+      <w:numFmt w:val="lowerRoman"/>
+      <w:lvlText w:val="%6."/>
+      <w:lvlJc w:val="right"/>
+      <w:pPr>
+        <w:ind w:left="4527" w:hanging="180"/>
+      </w:pPr>
+    </w:lvl>
+    <w:lvl w:ilvl="6" w:tplc="0419000F" w:tentative="1">
+      <w:start w:val="1"/>
+      <w:numFmt w:val="decimal"/>
+      <w:lvlText w:val="%7."/>
+      <w:lvlJc w:val="left"/>
+      <w:pPr>
+        <w:ind w:left="5247" w:hanging="360"/>
+      </w:pPr>
+    </w:lvl>
+    <w:lvl w:ilvl="7" w:tplc="04190019" w:tentative="1">
+      <w:start w:val="1"/>
+      <w:numFmt w:val="lowerLetter"/>
+      <w:lvlText w:val="%8."/>
+      <w:lvlJc w:val="left"/>
+      <w:pPr>
+        <w:ind w:left="5967" w:hanging="360"/>
+      </w:pPr>
+    </w:lvl>
+    <w:lvl w:ilvl="8" w:tplc="0419001B" w:tentative="1">
+      <w:start w:val="1"/>
+      <w:numFmt w:val="lowerRoman"/>
+      <w:lvlText w:val="%9."/>
+      <w:lvlJc w:val="right"/>
+      <w:pPr>
+        <w:ind w:left="6687" w:hanging="180"/>
+      </w:pPr>
+    </w:lvl>
+  </w:abstractNum>
+  <w:abstractNum w:abstractNumId="2" w15:restartNumberingAfterBreak="0">
     <w:nsid w:val="358D2A61"/>
     <w:multiLevelType w:val="hybridMultilevel"/>
     <w:tmpl w:val="F6C0DAD8"/>
@@ -879,7 +3883,96 @@
       </w:pPr>
     </w:lvl>
   </w:abstractNum>
-  <w:abstractNum w:abstractNumId="2" w15:restartNumberingAfterBreak="0">
+  <w:abstractNum w:abstractNumId="3" w15:restartNumberingAfterBreak="0">
+    <w:nsid w:val="3616306E"/>
+    <w:multiLevelType w:val="hybridMultilevel"/>
+    <w:tmpl w:val="C30A08F4"/>
+    <w:lvl w:ilvl="0" w:tplc="7A326FBA">
+      <w:start w:val="1"/>
+      <w:numFmt w:val="upperLetter"/>
+      <w:lvlText w:val="%1)"/>
+      <w:lvlJc w:val="left"/>
+      <w:pPr>
+        <w:ind w:left="927" w:hanging="360"/>
+      </w:pPr>
+      <w:rPr>
+        <w:rFonts w:hint="default"/>
+      </w:rPr>
+    </w:lvl>
+    <w:lvl w:ilvl="1" w:tplc="04190019" w:tentative="1">
+      <w:start w:val="1"/>
+      <w:numFmt w:val="lowerLetter"/>
+      <w:lvlText w:val="%2."/>
+      <w:lvlJc w:val="left"/>
+      <w:pPr>
+        <w:ind w:left="1647" w:hanging="360"/>
+      </w:pPr>
+    </w:lvl>
+    <w:lvl w:ilvl="2" w:tplc="0419001B" w:tentative="1">
+      <w:start w:val="1"/>
+      <w:numFmt w:val="lowerRoman"/>
+      <w:lvlText w:val="%3."/>
+      <w:lvlJc w:val="right"/>
+      <w:pPr>
+        <w:ind w:left="2367" w:hanging="180"/>
+      </w:pPr>
+    </w:lvl>
+    <w:lvl w:ilvl="3" w:tplc="0419000F" w:tentative="1">
+      <w:start w:val="1"/>
+      <w:numFmt w:val="decimal"/>
+      <w:lvlText w:val="%4."/>
+      <w:lvlJc w:val="left"/>
+      <w:pPr>
+        <w:ind w:left="3087" w:hanging="360"/>
+      </w:pPr>
+    </w:lvl>
+    <w:lvl w:ilvl="4" w:tplc="04190019" w:tentative="1">
+      <w:start w:val="1"/>
+      <w:numFmt w:val="lowerLetter"/>
+      <w:lvlText w:val="%5."/>
+      <w:lvlJc w:val="left"/>
+      <w:pPr>
+        <w:ind w:left="3807" w:hanging="360"/>
+      </w:pPr>
+    </w:lvl>
+    <w:lvl w:ilvl="5" w:tplc="0419001B" w:tentative="1">
+      <w:start w:val="1"/>
+      <w:numFmt w:val="lowerRoman"/>
+      <w:lvlText w:val="%6."/>
+      <w:lvlJc w:val="right"/>
+      <w:pPr>
+        <w:ind w:left="4527" w:hanging="180"/>
+      </w:pPr>
+    </w:lvl>
+    <w:lvl w:ilvl="6" w:tplc="0419000F" w:tentative="1">
+      <w:start w:val="1"/>
+      <w:numFmt w:val="decimal"/>
+      <w:lvlText w:val="%7."/>
+      <w:lvlJc w:val="left"/>
+      <w:pPr>
+        <w:ind w:left="5247" w:hanging="360"/>
+      </w:pPr>
+    </w:lvl>
+    <w:lvl w:ilvl="7" w:tplc="04190019" w:tentative="1">
+      <w:start w:val="1"/>
+      <w:numFmt w:val="lowerLetter"/>
+      <w:lvlText w:val="%8."/>
+      <w:lvlJc w:val="left"/>
+      <w:pPr>
+        <w:ind w:left="5967" w:hanging="360"/>
+      </w:pPr>
+    </w:lvl>
+    <w:lvl w:ilvl="8" w:tplc="0419001B" w:tentative="1">
+      <w:start w:val="1"/>
+      <w:numFmt w:val="lowerRoman"/>
+      <w:lvlText w:val="%9."/>
+      <w:lvlJc w:val="right"/>
+      <w:pPr>
+        <w:ind w:left="6687" w:hanging="180"/>
+      </w:pPr>
+    </w:lvl>
+  </w:abstractNum>
+  <w:abstractNum w:abstractNumId="4" w15:restartNumberingAfterBreak="0">
     <w:nsid w:val="3C3E5ECD"/>
     <w:multiLevelType w:val="hybridMultilevel"/>
     <w:tmpl w:val="6054E74E"/>
@@ -968,7 +4061,543 @@
       </w:pPr>
     </w:lvl>
   </w:abstractNum>
-  <w:abstractNum w:abstractNumId="3" w15:restartNumberingAfterBreak="0">
+  <w:abstractNum w:abstractNumId="5" w15:restartNumberingAfterBreak="0">
+    <w:nsid w:val="3CB477D5"/>
+    <w:multiLevelType w:val="hybridMultilevel"/>
+    <w:tmpl w:val="C30A08F4"/>
+    <w:lvl w:ilvl="0" w:tplc="7A326FBA">
+      <w:start w:val="1"/>
+      <w:numFmt w:val="upperLetter"/>
+      <w:lvlText w:val="%1)"/>
+      <w:lvlJc w:val="left"/>
+      <w:pPr>
+        <w:ind w:left="927" w:hanging="360"/>
+      </w:pPr>
+      <w:rPr>
+        <w:rFonts w:hint="default"/>
+      </w:rPr>
+    </w:lvl>
+    <w:lvl w:ilvl="1" w:tplc="04190019" w:tentative="1">
+      <w:start w:val="1"/>
+      <w:numFmt w:val="lowerLetter"/>
+      <w:lvlText w:val="%2."/>
+      <w:lvlJc w:val="left"/>
+      <w:pPr>
+        <w:ind w:left="1647" w:hanging="360"/>
+      </w:pPr>
+    </w:lvl>
+    <w:lvl w:ilvl="2" w:tplc="0419001B" w:tentative="1">
+      <w:start w:val="1"/>
+      <w:numFmt w:val="lowerRoman"/>
+      <w:lvlText w:val="%3."/>
+      <w:lvlJc w:val="right"/>
+      <w:pPr>
+        <w:ind w:left="2367" w:hanging="180"/>
+      </w:pPr>
+    </w:lvl>
+    <w:lvl w:ilvl="3" w:tplc="0419000F" w:tentative="1">
+      <w:start w:val="1"/>
+      <w:numFmt w:val="decimal"/>
+      <w:lvlText w:val="%4."/>
+      <w:lvlJc w:val="left"/>
+      <w:pPr>
+        <w:ind w:left="3087" w:hanging="360"/>
+      </w:pPr>
+    </w:lvl>
+    <w:lvl w:ilvl="4" w:tplc="04190019" w:tentative="1">
+      <w:start w:val="1"/>
+      <w:numFmt w:val="lowerLetter"/>
+      <w:lvlText w:val="%5."/>
+      <w:lvlJc w:val="left"/>
+      <w:pPr>
+        <w:ind w:left="3807" w:hanging="360"/>
+      </w:pPr>
+    </w:lvl>
+    <w:lvl w:ilvl="5" w:tplc="0419001B" w:tentative="1">
+      <w:start w:val="1"/>
+      <w:numFmt w:val="lowerRoman"/>
+      <w:lvlText w:val="%6."/>
+      <w:lvlJc w:val="right"/>
+      <w:pPr>
+        <w:ind w:left="4527" w:hanging="180"/>
+      </w:pPr>
+    </w:lvl>
+    <w:lvl w:ilvl="6" w:tplc="0419000F" w:tentative="1">
+      <w:start w:val="1"/>
+      <w:numFmt w:val="decimal"/>
+      <w:lvlText w:val="%7."/>
+      <w:lvlJc w:val="left"/>
+      <w:pPr>
+        <w:ind w:left="5247" w:hanging="360"/>
+      </w:pPr>
+    </w:lvl>
+    <w:lvl w:ilvl="7" w:tplc="04190019" w:tentative="1">
+      <w:start w:val="1"/>
+      <w:numFmt w:val="lowerLetter"/>
+      <w:lvlText w:val="%8."/>
+      <w:lvlJc w:val="left"/>
+      <w:pPr>
+        <w:ind w:left="5967" w:hanging="360"/>
+      </w:pPr>
+    </w:lvl>
+    <w:lvl w:ilvl="8" w:tplc="0419001B" w:tentative="1">
+      <w:start w:val="1"/>
+      <w:numFmt w:val="lowerRoman"/>
+      <w:lvlText w:val="%9."/>
+      <w:lvlJc w:val="right"/>
+      <w:pPr>
+        <w:ind w:left="6687" w:hanging="180"/>
+      </w:pPr>
+    </w:lvl>
+  </w:abstractNum>
+  <w:abstractNum w:abstractNumId="6" w15:restartNumberingAfterBreak="0">
+    <w:nsid w:val="457D1936"/>
+    <w:multiLevelType w:val="hybridMultilevel"/>
+    <w:tmpl w:val="C30A08F4"/>
+    <w:lvl w:ilvl="0" w:tplc="7A326FBA">
+      <w:start w:val="1"/>
+      <w:numFmt w:val="upperLetter"/>
+      <w:lvlText w:val="%1)"/>
+      <w:lvlJc w:val="left"/>
+      <w:pPr>
+        <w:ind w:left="927" w:hanging="360"/>
+      </w:pPr>
+      <w:rPr>
+        <w:rFonts w:hint="default"/>
+      </w:rPr>
+    </w:lvl>
+    <w:lvl w:ilvl="1" w:tplc="04190019" w:tentative="1">
+      <w:start w:val="1"/>
+      <w:numFmt w:val="lowerLetter"/>
+      <w:lvlText w:val="%2."/>
+      <w:lvlJc w:val="left"/>
+      <w:pPr>
+        <w:ind w:left="1647" w:hanging="360"/>
+      </w:pPr>
+    </w:lvl>
+    <w:lvl w:ilvl="2" w:tplc="0419001B" w:tentative="1">
+      <w:start w:val="1"/>
+      <w:numFmt w:val="lowerRoman"/>
+      <w:lvlText w:val="%3."/>
+      <w:lvlJc w:val="right"/>
+      <w:pPr>
+        <w:ind w:left="2367" w:hanging="180"/>
+      </w:pPr>
+    </w:lvl>
+    <w:lvl w:ilvl="3" w:tplc="0419000F" w:tentative="1">
+      <w:start w:val="1"/>
+      <w:numFmt w:val="decimal"/>
+      <w:lvlText w:val="%4."/>
+      <w:lvlJc w:val="left"/>
+      <w:pPr>
+        <w:ind w:left="3087" w:hanging="360"/>
+      </w:pPr>
+    </w:lvl>
+    <w:lvl w:ilvl="4" w:tplc="04190019" w:tentative="1">
+      <w:start w:val="1"/>
+      <w:numFmt w:val="lowerLetter"/>
+      <w:lvlText w:val="%5."/>
+      <w:lvlJc w:val="left"/>
+      <w:pPr>
+        <w:ind w:left="3807" w:hanging="360"/>
+      </w:pPr>
+    </w:lvl>
+    <w:lvl w:ilvl="5" w:tplc="0419001B" w:tentative="1">
+      <w:start w:val="1"/>
+      <w:numFmt w:val="lowerRoman"/>
+      <w:lvlText w:val="%6."/>
+      <w:lvlJc w:val="right"/>
+      <w:pPr>
+        <w:ind w:left="4527" w:hanging="180"/>
+      </w:pPr>
+    </w:lvl>
+    <w:lvl w:ilvl="6" w:tplc="0419000F" w:tentative="1">
+      <w:start w:val="1"/>
+      <w:numFmt w:val="decimal"/>
+      <w:lvlText w:val="%7."/>
+      <w:lvlJc w:val="left"/>
+      <w:pPr>
+        <w:ind w:left="5247" w:hanging="360"/>
+      </w:pPr>
+    </w:lvl>
+    <w:lvl w:ilvl="7" w:tplc="04190019" w:tentative="1">
+      <w:start w:val="1"/>
+      <w:numFmt w:val="lowerLetter"/>
+      <w:lvlText w:val="%8."/>
+      <w:lvlJc w:val="left"/>
+      <w:pPr>
+        <w:ind w:left="5967" w:hanging="360"/>
+      </w:pPr>
+    </w:lvl>
+    <w:lvl w:ilvl="8" w:tplc="0419001B" w:tentative="1">
+      <w:start w:val="1"/>
+      <w:numFmt w:val="lowerRoman"/>
+      <w:lvlText w:val="%9."/>
+      <w:lvlJc w:val="right"/>
+      <w:pPr>
+        <w:ind w:left="6687" w:hanging="180"/>
+      </w:pPr>
+    </w:lvl>
+  </w:abstractNum>
+  <w:abstractNum w:abstractNumId="7" w15:restartNumberingAfterBreak="0">
+    <w:nsid w:val="5A2B5EC8"/>
+    <w:multiLevelType w:val="hybridMultilevel"/>
+    <w:tmpl w:val="C30A08F4"/>
+    <w:lvl w:ilvl="0" w:tplc="7A326FBA">
+      <w:start w:val="1"/>
+      <w:numFmt w:val="upperLetter"/>
+      <w:lvlText w:val="%1)"/>
+      <w:lvlJc w:val="left"/>
+      <w:pPr>
+        <w:ind w:left="927" w:hanging="360"/>
+      </w:pPr>
+      <w:rPr>
+        <w:rFonts w:hint="default"/>
+      </w:rPr>
+    </w:lvl>
+    <w:lvl w:ilvl="1" w:tplc="04190019" w:tentative="1">
+      <w:start w:val="1"/>
+      <w:numFmt w:val="lowerLetter"/>
+      <w:lvlText w:val="%2."/>
+      <w:lvlJc w:val="left"/>
+      <w:pPr>
+        <w:ind w:left="1647" w:hanging="360"/>
+      </w:pPr>
+    </w:lvl>
+    <w:lvl w:ilvl="2" w:tplc="0419001B" w:tentative="1">
+      <w:start w:val="1"/>
+      <w:numFmt w:val="lowerRoman"/>
+      <w:lvlText w:val="%3."/>
+      <w:lvlJc w:val="right"/>
+      <w:pPr>
+        <w:ind w:left="2367" w:hanging="180"/>
+      </w:pPr>
+    </w:lvl>
+    <w:lvl w:ilvl="3" w:tplc="0419000F" w:tentative="1">
+      <w:start w:val="1"/>
+      <w:numFmt w:val="decimal"/>
+      <w:lvlText w:val="%4."/>
+      <w:lvlJc w:val="left"/>
+      <w:pPr>
+        <w:ind w:left="3087" w:hanging="360"/>
+      </w:pPr>
+    </w:lvl>
+    <w:lvl w:ilvl="4" w:tplc="04190019" w:tentative="1">
+      <w:start w:val="1"/>
+      <w:numFmt w:val="lowerLetter"/>
+      <w:lvlText w:val="%5."/>
+      <w:lvlJc w:val="left"/>
+      <w:pPr>
+        <w:ind w:left="3807" w:hanging="360"/>
+      </w:pPr>
+    </w:lvl>
+    <w:lvl w:ilvl="5" w:tplc="0419001B" w:tentative="1">
+      <w:start w:val="1"/>
+      <w:numFmt w:val="lowerRoman"/>
+      <w:lvlText w:val="%6."/>
+      <w:lvlJc w:val="right"/>
+      <w:pPr>
+        <w:ind w:left="4527" w:hanging="180"/>
+      </w:pPr>
+    </w:lvl>
+    <w:lvl w:ilvl="6" w:tplc="0419000F" w:tentative="1">
+      <w:start w:val="1"/>
+      <w:numFmt w:val="decimal"/>
+      <w:lvlText w:val="%7."/>
+      <w:lvlJc w:val="left"/>
+      <w:pPr>
+        <w:ind w:left="5247" w:hanging="360"/>
+      </w:pPr>
+    </w:lvl>
+    <w:lvl w:ilvl="7" w:tplc="04190019" w:tentative="1">
+      <w:start w:val="1"/>
+      <w:numFmt w:val="lowerLetter"/>
+      <w:lvlText w:val="%8."/>
+      <w:lvlJc w:val="left"/>
+      <w:pPr>
+        <w:ind w:left="5967" w:hanging="360"/>
+      </w:pPr>
+    </w:lvl>
+    <w:lvl w:ilvl="8" w:tplc="0419001B" w:tentative="1">
+      <w:start w:val="1"/>
+      <w:numFmt w:val="lowerRoman"/>
+      <w:lvlText w:val="%9."/>
+      <w:lvlJc w:val="right"/>
+      <w:pPr>
+        <w:ind w:left="6687" w:hanging="180"/>
+      </w:pPr>
+    </w:lvl>
+  </w:abstractNum>
+  <w:abstractNum w:abstractNumId="8" w15:restartNumberingAfterBreak="0">
+    <w:nsid w:val="5F0D4EDD"/>
+    <w:multiLevelType w:val="hybridMultilevel"/>
+    <w:tmpl w:val="C30A08F4"/>
+    <w:lvl w:ilvl="0" w:tplc="7A326FBA">
+      <w:start w:val="1"/>
+      <w:numFmt w:val="upperLetter"/>
+      <w:lvlText w:val="%1)"/>
+      <w:lvlJc w:val="left"/>
+      <w:pPr>
+        <w:ind w:left="927" w:hanging="360"/>
+      </w:pPr>
+      <w:rPr>
+        <w:rFonts w:hint="default"/>
+      </w:rPr>
+    </w:lvl>
+    <w:lvl w:ilvl="1" w:tplc="04190019" w:tentative="1">
+      <w:start w:val="1"/>
+      <w:numFmt w:val="lowerLetter"/>
+      <w:lvlText w:val="%2."/>
+      <w:lvlJc w:val="left"/>
+      <w:pPr>
+        <w:ind w:left="1647" w:hanging="360"/>
+      </w:pPr>
+    </w:lvl>
+    <w:lvl w:ilvl="2" w:tplc="0419001B" w:tentative="1">
+      <w:start w:val="1"/>
+      <w:numFmt w:val="lowerRoman"/>
+      <w:lvlText w:val="%3."/>
+      <w:lvlJc w:val="right"/>
+      <w:pPr>
+        <w:ind w:left="2367" w:hanging="180"/>
+      </w:pPr>
+    </w:lvl>
+    <w:lvl w:ilvl="3" w:tplc="0419000F" w:tentative="1">
+      <w:start w:val="1"/>
+      <w:numFmt w:val="decimal"/>
+      <w:lvlText w:val="%4."/>
+      <w:lvlJc w:val="left"/>
+      <w:pPr>
+        <w:ind w:left="3087" w:hanging="360"/>
+      </w:pPr>
+    </w:lvl>
+    <w:lvl w:ilvl="4" w:tplc="04190019" w:tentative="1">
+      <w:start w:val="1"/>
+      <w:numFmt w:val="lowerLetter"/>
+      <w:lvlText w:val="%5."/>
+      <w:lvlJc w:val="left"/>
+      <w:pPr>
+        <w:ind w:left="3807" w:hanging="360"/>
+      </w:pPr>
+    </w:lvl>
+    <w:lvl w:ilvl="5" w:tplc="0419001B" w:tentative="1">
+      <w:start w:val="1"/>
+      <w:numFmt w:val="lowerRoman"/>
+      <w:lvlText w:val="%6."/>
+      <w:lvlJc w:val="right"/>
+      <w:pPr>
+        <w:ind w:left="4527" w:hanging="180"/>
+      </w:pPr>
+    </w:lvl>
+    <w:lvl w:ilvl="6" w:tplc="0419000F" w:tentative="1">
+      <w:start w:val="1"/>
+      <w:numFmt w:val="decimal"/>
+      <w:lvlText w:val="%7."/>
+      <w:lvlJc w:val="left"/>
+      <w:pPr>
+        <w:ind w:left="5247" w:hanging="360"/>
+      </w:pPr>
+    </w:lvl>
+    <w:lvl w:ilvl="7" w:tplc="04190019" w:tentative="1">
+      <w:start w:val="1"/>
+      <w:numFmt w:val="lowerLetter"/>
+      <w:lvlText w:val="%8."/>
+      <w:lvlJc w:val="left"/>
+      <w:pPr>
+        <w:ind w:left="5967" w:hanging="360"/>
+      </w:pPr>
+    </w:lvl>
+    <w:lvl w:ilvl="8" w:tplc="0419001B" w:tentative="1">
+      <w:start w:val="1"/>
+      <w:numFmt w:val="lowerRoman"/>
+      <w:lvlText w:val="%9."/>
+      <w:lvlJc w:val="right"/>
+      <w:pPr>
+        <w:ind w:left="6687" w:hanging="180"/>
+      </w:pPr>
+    </w:lvl>
+  </w:abstractNum>
+  <w:abstractNum w:abstractNumId="9" w15:restartNumberingAfterBreak="0">
+    <w:nsid w:val="60125073"/>
+    <w:multiLevelType w:val="hybridMultilevel"/>
+    <w:tmpl w:val="C352C4A0"/>
+    <w:lvl w:ilvl="0" w:tplc="04190011">
+      <w:start w:val="1"/>
+      <w:numFmt w:val="decimal"/>
+      <w:lvlText w:val="%1)"/>
+      <w:lvlJc w:val="left"/>
+      <w:pPr>
+        <w:ind w:left="720" w:hanging="360"/>
+      </w:pPr>
+      <w:rPr>
+        <w:rFonts w:hint="default"/>
+      </w:rPr>
+    </w:lvl>
+    <w:lvl w:ilvl="1" w:tplc="04190019" w:tentative="1">
+      <w:start w:val="1"/>
+      <w:numFmt w:val="lowerLetter"/>
+      <w:lvlText w:val="%2."/>
+      <w:lvlJc w:val="left"/>
+      <w:pPr>
+        <w:ind w:left="1440" w:hanging="360"/>
+      </w:pPr>
+    </w:lvl>
+    <w:lvl w:ilvl="2" w:tplc="0419001B" w:tentative="1">
+      <w:start w:val="1"/>
+      <w:numFmt w:val="lowerRoman"/>
+      <w:lvlText w:val="%3."/>
+      <w:lvlJc w:val="right"/>
+      <w:pPr>
+        <w:ind w:left="2160" w:hanging="180"/>
+      </w:pPr>
+    </w:lvl>
+    <w:lvl w:ilvl="3" w:tplc="0419000F" w:tentative="1">
+      <w:start w:val="1"/>
+      <w:numFmt w:val="decimal"/>
+      <w:lvlText w:val="%4."/>
+      <w:lvlJc w:val="left"/>
+      <w:pPr>
+        <w:ind w:left="2880" w:hanging="360"/>
+      </w:pPr>
+    </w:lvl>
+    <w:lvl w:ilvl="4" w:tplc="04190019" w:tentative="1">
+      <w:start w:val="1"/>
+      <w:numFmt w:val="lowerLetter"/>
+      <w:lvlText w:val="%5."/>
+      <w:lvlJc w:val="left"/>
+      <w:pPr>
+        <w:ind w:left="3600" w:hanging="360"/>
+      </w:pPr>
+    </w:lvl>
+    <w:lvl w:ilvl="5" w:tplc="0419001B" w:tentative="1">
+      <w:start w:val="1"/>
+      <w:numFmt w:val="lowerRoman"/>
+      <w:lvlText w:val="%6."/>
+      <w:lvlJc w:val="right"/>
+      <w:pPr>
+        <w:ind w:left="4320" w:hanging="180"/>
+      </w:pPr>
+    </w:lvl>
+    <w:lvl w:ilvl="6" w:tplc="0419000F" w:tentative="1">
+      <w:start w:val="1"/>
+      <w:numFmt w:val="decimal"/>
+      <w:lvlText w:val="%7."/>
+      <w:lvlJc w:val="left"/>
+      <w:pPr>
+        <w:ind w:left="5040" w:hanging="360"/>
+      </w:pPr>
+    </w:lvl>
+    <w:lvl w:ilvl="7" w:tplc="04190019" w:tentative="1">
+      <w:start w:val="1"/>
+      <w:numFmt w:val="lowerLetter"/>
+      <w:lvlText w:val="%8."/>
+      <w:lvlJc w:val="left"/>
+      <w:pPr>
+        <w:ind w:left="5760" w:hanging="360"/>
+      </w:pPr>
+    </w:lvl>
+    <w:lvl w:ilvl="8" w:tplc="0419001B" w:tentative="1">
+      <w:start w:val="1"/>
+      <w:numFmt w:val="lowerRoman"/>
+      <w:lvlText w:val="%9."/>
+      <w:lvlJc w:val="right"/>
+      <w:pPr>
+        <w:ind w:left="6480" w:hanging="180"/>
+      </w:pPr>
+    </w:lvl>
+  </w:abstractNum>
+  <w:abstractNum w:abstractNumId="10" w15:restartNumberingAfterBreak="0">
+    <w:nsid w:val="6800095F"/>
+    <w:multiLevelType w:val="hybridMultilevel"/>
+    <w:tmpl w:val="F1643AF8"/>
+    <w:lvl w:ilvl="0" w:tplc="BB1215C4">
+      <w:start w:val="1"/>
+      <w:numFmt w:val="decimal"/>
+      <w:lvlText w:val="%1)"/>
+      <w:lvlJc w:val="left"/>
+      <w:pPr>
+        <w:ind w:left="720" w:hanging="360"/>
+      </w:pPr>
+      <w:rPr>
+        <w:rFonts w:hint="default"/>
+        <w:sz w:val="28"/>
+        <w:szCs w:val="28"/>
+      </w:rPr>
+    </w:lvl>
+    <w:lvl w:ilvl="1" w:tplc="04190019" w:tentative="1">
+      <w:start w:val="1"/>
+      <w:numFmt w:val="lowerLetter"/>
+      <w:lvlText w:val="%2."/>
+      <w:lvlJc w:val="left"/>
+      <w:pPr>
+        <w:ind w:left="1440" w:hanging="360"/>
+      </w:pPr>
+    </w:lvl>
+    <w:lvl w:ilvl="2" w:tplc="0419001B" w:tentative="1">
+      <w:start w:val="1"/>
+      <w:numFmt w:val="lowerRoman"/>
+      <w:lvlText w:val="%3."/>
+      <w:lvlJc w:val="right"/>
+      <w:pPr>
+        <w:ind w:left="2160" w:hanging="180"/>
+      </w:pPr>
+    </w:lvl>
+    <w:lvl w:ilvl="3" w:tplc="0419000F" w:tentative="1">
+      <w:start w:val="1"/>
+      <w:numFmt w:val="decimal"/>
+      <w:lvlText w:val="%4."/>
+      <w:lvlJc w:val="left"/>
+      <w:pPr>
+        <w:ind w:left="2880" w:hanging="360"/>
+      </w:pPr>
+    </w:lvl>
+    <w:lvl w:ilvl="4" w:tplc="04190019" w:tentative="1">
+      <w:start w:val="1"/>
+      <w:numFmt w:val="lowerLetter"/>
+      <w:lvlText w:val="%5."/>
+      <w:lvlJc w:val="left"/>
+      <w:pPr>
+        <w:ind w:left="3600" w:hanging="360"/>
+      </w:pPr>
+    </w:lvl>
+    <w:lvl w:ilvl="5" w:tplc="0419001B" w:tentative="1">
+      <w:start w:val="1"/>
+      <w:numFmt w:val="lowerRoman"/>
+      <w:lvlText w:val="%6."/>
+      <w:lvlJc w:val="right"/>
+      <w:pPr>
+        <w:ind w:left="4320" w:hanging="180"/>
+      </w:pPr>
+    </w:lvl>
+    <w:lvl w:ilvl="6" w:tplc="0419000F" w:tentative="1">
+      <w:start w:val="1"/>
+      <w:numFmt w:val="decimal"/>
+      <w:lvlText w:val="%7."/>
+      <w:lvlJc w:val="left"/>
+      <w:pPr>
+        <w:ind w:left="5040" w:hanging="360"/>
+      </w:pPr>
+    </w:lvl>
+    <w:lvl w:ilvl="7" w:tplc="04190019" w:tentative="1">
+      <w:start w:val="1"/>
+      <w:numFmt w:val="lowerLetter"/>
+      <w:lvlText w:val="%8."/>
+      <w:lvlJc w:val="left"/>
+      <w:pPr>
+        <w:ind w:left="5760" w:hanging="360"/>
+      </w:pPr>
+    </w:lvl>
+    <w:lvl w:ilvl="8" w:tplc="0419001B" w:tentative="1">
+      <w:start w:val="1"/>
+      <w:numFmt w:val="lowerRoman"/>
+      <w:lvlText w:val="%9."/>
+      <w:lvlJc w:val="right"/>
+      <w:pPr>
+        <w:ind w:left="6480" w:hanging="180"/>
+      </w:pPr>
+    </w:lvl>
+  </w:abstractNum>
+  <w:abstractNum w:abstractNumId="11" w15:restartNumberingAfterBreak="0">
     <w:nsid w:val="6CAB2913"/>
     <w:multiLevelType w:val="hybridMultilevel"/>
     <w:tmpl w:val="41420942"/>
@@ -1057,7 +4686,96 @@
       </w:pPr>
     </w:lvl>
   </w:abstractNum>
-  <w:abstractNum w:abstractNumId="4" w15:restartNumberingAfterBreak="0">
+  <w:abstractNum w:abstractNumId="12" w15:restartNumberingAfterBreak="0">
+    <w:nsid w:val="703D1F32"/>
+    <w:multiLevelType w:val="hybridMultilevel"/>
+    <w:tmpl w:val="C30A08F4"/>
+    <w:lvl w:ilvl="0" w:tplc="7A326FBA">
+      <w:start w:val="1"/>
+      <w:numFmt w:val="upperLetter"/>
+      <w:lvlText w:val="%1)"/>
+      <w:lvlJc w:val="left"/>
+      <w:pPr>
+        <w:ind w:left="927" w:hanging="360"/>
+      </w:pPr>
+      <w:rPr>
+        <w:rFonts w:hint="default"/>
+      </w:rPr>
+    </w:lvl>
+    <w:lvl w:ilvl="1" w:tplc="04190019" w:tentative="1">
+      <w:start w:val="1"/>
+      <w:numFmt w:val="lowerLetter"/>
+      <w:lvlText w:val="%2."/>
+      <w:lvlJc w:val="left"/>
+      <w:pPr>
+        <w:ind w:left="1647" w:hanging="360"/>
+      </w:pPr>
+    </w:lvl>
+    <w:lvl w:ilvl="2" w:tplc="0419001B" w:tentative="1">
+      <w:start w:val="1"/>
+      <w:numFmt w:val="lowerRoman"/>
+      <w:lvlText w:val="%3."/>
+      <w:lvlJc w:val="right"/>
+      <w:pPr>
+        <w:ind w:left="2367" w:hanging="180"/>
+      </w:pPr>
+    </w:lvl>
+    <w:lvl w:ilvl="3" w:tplc="0419000F" w:tentative="1">
+      <w:start w:val="1"/>
+      <w:numFmt w:val="decimal"/>
+      <w:lvlText w:val="%4."/>
+      <w:lvlJc w:val="left"/>
+      <w:pPr>
+        <w:ind w:left="3087" w:hanging="360"/>
+      </w:pPr>
+    </w:lvl>
+    <w:lvl w:ilvl="4" w:tplc="04190019" w:tentative="1">
+      <w:start w:val="1"/>
+      <w:numFmt w:val="lowerLetter"/>
+      <w:lvlText w:val="%5."/>
+      <w:lvlJc w:val="left"/>
+      <w:pPr>
+        <w:ind w:left="3807" w:hanging="360"/>
+      </w:pPr>
+    </w:lvl>
+    <w:lvl w:ilvl="5" w:tplc="0419001B" w:tentative="1">
+      <w:start w:val="1"/>
+      <w:numFmt w:val="lowerRoman"/>
+      <w:lvlText w:val="%6."/>
+      <w:lvlJc w:val="right"/>
+      <w:pPr>
+        <w:ind w:left="4527" w:hanging="180"/>
+      </w:pPr>
+    </w:lvl>
+    <w:lvl w:ilvl="6" w:tplc="0419000F" w:tentative="1">
+      <w:start w:val="1"/>
+      <w:numFmt w:val="decimal"/>
+      <w:lvlText w:val="%7."/>
+      <w:lvlJc w:val="left"/>
+      <w:pPr>
+        <w:ind w:left="5247" w:hanging="360"/>
+      </w:pPr>
+    </w:lvl>
+    <w:lvl w:ilvl="7" w:tplc="04190019" w:tentative="1">
+      <w:start w:val="1"/>
+      <w:numFmt w:val="lowerLetter"/>
+      <w:lvlText w:val="%8."/>
+      <w:lvlJc w:val="left"/>
+      <w:pPr>
+        <w:ind w:left="5967" w:hanging="360"/>
+      </w:pPr>
+    </w:lvl>
+    <w:lvl w:ilvl="8" w:tplc="0419001B" w:tentative="1">
+      <w:start w:val="1"/>
+      <w:numFmt w:val="lowerRoman"/>
+      <w:lvlText w:val="%9."/>
+      <w:lvlJc w:val="right"/>
+      <w:pPr>
+        <w:ind w:left="6687" w:hanging="180"/>
+      </w:pPr>
+    </w:lvl>
+  </w:abstractNum>
+  <w:abstractNum w:abstractNumId="13" w15:restartNumberingAfterBreak="0">
     <w:nsid w:val="795929AC"/>
     <w:multiLevelType w:val="hybridMultilevel"/>
     <w:tmpl w:val="AF68C14E"/>
@@ -1147,19 +4865,46 @@
     </w:lvl>
   </w:abstractNum>
   <w:num w:numId="1">
-    <w:abstractNumId w:val="2"/>
+    <w:abstractNumId w:val="4"/>
   </w:num>
   <w:num w:numId="2">
-    <w:abstractNumId w:val="4"/>
+    <w:abstractNumId w:val="13"/>
   </w:num>
   <w:num w:numId="3">
-    <w:abstractNumId w:val="1"/>
+    <w:abstractNumId w:val="2"/>
   </w:num>
   <w:num w:numId="4">
     <w:abstractNumId w:val="0"/>
   </w:num>
   <w:num w:numId="5">
+    <w:abstractNumId w:val="11"/>
+  </w:num>
+  <w:num w:numId="6">
+    <w:abstractNumId w:val="9"/>
+  </w:num>
+  <w:num w:numId="7">
+    <w:abstractNumId w:val="10"/>
+  </w:num>
+  <w:num w:numId="8">
+    <w:abstractNumId w:val="7"/>
+  </w:num>
+  <w:num w:numId="9">
+    <w:abstractNumId w:val="12"/>
+  </w:num>
+  <w:num w:numId="10">
     <w:abstractNumId w:val="3"/>
+  </w:num>
+  <w:num w:numId="11">
+    <w:abstractNumId w:val="8"/>
+  </w:num>
+  <w:num w:numId="12">
+    <w:abstractNumId w:val="6"/>
+  </w:num>
+  <w:num w:numId="13">
+    <w:abstractNumId w:val="5"/>
+  </w:num>
+  <w:num w:numId="14">
+    <w:abstractNumId w:val="1"/>
   </w:num>
 </w:numbering>
 </file>
@@ -1172,7 +4917,7 @@
         <w:rFonts w:asciiTheme="minorHAnsi" w:eastAsiaTheme="minorHAnsi" w:hAnsiTheme="minorHAnsi" w:cstheme="minorBidi"/>
         <w:sz w:val="22"/>
         <w:szCs w:val="22"/>
-        <w:lang w:val="ru-RU" w:eastAsia="en-US" w:bidi="ar-SA"/>
+        <w:lang w:val="en" w:eastAsia="en-US" w:bidi="ar-SA"/>
       </w:rPr>
     </w:rPrDefault>
     <w:pPrDefault>
@@ -1694,7 +5439,6 @@
       <w:rFonts w:ascii="Arial" w:hAnsi="Arial" w:cs="Times New Roman"/>
       <w:sz w:val="2"/>
       <w:szCs w:val="28"/>
-      <w:lang w:val="en-US"/>
     </w:rPr>
   </w:style>
   <w:style w:type="character" w:customStyle="1" w:styleId="50">
@@ -1707,7 +5451,7 @@
       <w:b/>
       <w:sz w:val="24"/>
       <w:szCs w:val="20"/>
-      <w:lang w:eastAsia="ru-RU"/>
+      <w:lang w:val="en" w:eastAsia="ru-RU"/>
     </w:rPr>
   </w:style>
   <w:style w:type="character" w:customStyle="1" w:styleId="aa">
@@ -1719,7 +5463,7 @@
       <w:rFonts w:ascii="Arial" w:hAnsi="Arial" w:cs="Times New Roman"/>
       <w:sz w:val="2"/>
       <w:szCs w:val="28"/>
-      <w:lang w:val="en-US"/>
+      <w:lang w:val="en"/>
     </w:rPr>
   </w:style>
   <w:style w:type="paragraph" w:customStyle="1" w:styleId="ab">

</xml_diff>